<commit_message>
:bookmark: update doc tcc II and articles
</commit_message>
<xml_diff>
--- a/TCC II/[2025] TCC 2/TCCII_NIMSAI.docx
+++ b/TCC II/[2025] TCC 2/TCCII_NIMSAI.docx
@@ -20,23 +20,8 @@
         <w:rPr>
           <w:highlight w:val="lightGray"/>
         </w:rPr>
-        <w:t xml:space="preserve">Este trabalho propõe a aplicação de técnicas de aprendizado de máquina para a predição de desfechos clínicos em pacientes com SRAG, utilizando a base de dados aberta disponibilizada pelo </w:t>
-      </w:r>
-      <w:proofErr w:type="spellStart"/>
-      <w:r>
-        <w:rPr>
-          <w:highlight w:val="lightGray"/>
-        </w:rPr>
-        <w:t>DataSUS</w:t>
-      </w:r>
-      <w:proofErr w:type="spellEnd"/>
-      <w:r>
-        <w:rPr>
-          <w:highlight w:val="lightGray"/>
-        </w:rPr>
-        <w:t xml:space="preserve">. Além da construção e avaliação de modelos preditivos, também é abordado o desempenho computacional de um algoritmo desenvolvido para esse fim, denominado </w:t>
-      </w:r>
-      <w:proofErr w:type="spellStart"/>
+        <w:t xml:space="preserve">Este trabalho propõe a aplicação de técnicas de aprendizado de máquina para a predição de desfechos clínicos em pacientes com SRAG, utilizando a base de dados aberta disponibilizada pelo DataSUS. Além da construção e avaliação de modelos preditivos, também é abordado o desempenho computacional de um algoritmo desenvolvido para esse fim, denominado </w:t>
+      </w:r>
       <w:r>
         <w:rPr>
           <w:rStyle w:val="CdigoHTML"/>
@@ -45,26 +30,14 @@
         </w:rPr>
         <w:t>real_collab</w:t>
       </w:r>
-      <w:proofErr w:type="spellEnd"/>
-      <w:r>
-        <w:rPr>
-          <w:highlight w:val="lightGray"/>
-        </w:rPr>
-        <w:t xml:space="preserve">, executado em diferentes ambientes computacionais. A comparação entre os modelos </w:t>
-      </w:r>
-      <w:proofErr w:type="spellStart"/>
-      <w:r>
-        <w:rPr>
-          <w:highlight w:val="lightGray"/>
-        </w:rPr>
-        <w:t>Random</w:t>
-      </w:r>
-      <w:proofErr w:type="spellEnd"/>
-      <w:r>
-        <w:rPr>
-          <w:highlight w:val="lightGray"/>
-        </w:rPr>
-        <w:t xml:space="preserve"> Forest e CART, tanto em relação à eficácia preditiva quanto ao custo computacional, busca evidenciar as potencialidades e limitações de cada abordagem em um cenário real de dados de saúde pública.</w:t>
+      <w:r>
+        <w:rPr>
+          <w:highlight w:val="lightGray"/>
+        </w:rPr>
+        <w:t>, executado em diferentes ambientes computacionais. A comparação entre os modelos Random Forest e CART, tanto em relação à eficácia preditiva quanto ao custo computacional, busca evidenciar as potencialidades e limitações de cada abordagem em um cenário real de dados de saúde pública</w:t>
+      </w:r>
+      <w:r>
+        <w:t>.</w:t>
       </w:r>
     </w:p>
     <w:p/>
@@ -92,67 +65,7 @@
           <w:highlight w:val="lightGray"/>
           <w:lang w:eastAsia="pt-BR"/>
         </w:rPr>
-        <w:t xml:space="preserve">Este Trabalho de Conclusão de Curso está estruturado em sete capítulos. O Capítulo 1, Introdução, apresenta o contexto da pesquisa, destacando a importância do uso de técnicas de ciência de dados na área da saúde, especialmente no enfrentamento da Síndrome Respiratória Aguda Grave (SRAG). Também define o problema de pesquisa, os </w:t>
-      </w:r>
-      <w:proofErr w:type="gramStart"/>
-      <w:r>
-        <w:rPr>
-          <w:rFonts w:eastAsia="Times New Roman" w:cs="Times New Roman"/>
-          <w:szCs w:val="24"/>
-          <w:highlight w:val="lightGray"/>
-          <w:lang w:eastAsia="pt-BR"/>
-        </w:rPr>
-        <w:t>objetivos geral</w:t>
-      </w:r>
-      <w:proofErr w:type="gramEnd"/>
-      <w:r>
-        <w:rPr>
-          <w:rFonts w:eastAsia="Times New Roman" w:cs="Times New Roman"/>
-          <w:szCs w:val="24"/>
-          <w:highlight w:val="lightGray"/>
-          <w:lang w:eastAsia="pt-BR"/>
-        </w:rPr>
-        <w:t xml:space="preserve"> e específicos, e a justificativa do estudo. O Capítulo 2, Revisão Bibliográfica, aborda os fundamentos teóricos relacionados à SRAG, ao processo de descoberta de conhecimento em bases de dados (KDD), às etapas de pré-processamento, às técnicas de análise de dados e aos principais algoritmos de aprendizado de máquina aplicados à predição de desfechos clínicos. O Capítulo 3, Metodologia, descreve os dados utilizados, o processo de pré-processamento, as ferramentas adotadas para a análise e implementação dos modelos, os ambientes computacionais utilizados para a execução dos algoritmos e os critérios adotados para avaliação de desempenho preditivo e computacional. O Capítulo 4, Resultados, apresenta os resultados obtidos na aplicação do algoritmo desenvolvido (</w:t>
-      </w:r>
-      <w:proofErr w:type="spellStart"/>
-      <w:r>
-        <w:rPr>
-          <w:rFonts w:eastAsia="Times New Roman" w:cs="Times New Roman"/>
-          <w:szCs w:val="24"/>
-          <w:highlight w:val="lightGray"/>
-          <w:lang w:eastAsia="pt-BR"/>
-        </w:rPr>
-        <w:t>real_collab</w:t>
-      </w:r>
-      <w:proofErr w:type="spellEnd"/>
-      <w:r>
-        <w:rPr>
-          <w:rFonts w:eastAsia="Times New Roman" w:cs="Times New Roman"/>
-          <w:szCs w:val="24"/>
-          <w:highlight w:val="lightGray"/>
-          <w:lang w:eastAsia="pt-BR"/>
-        </w:rPr>
-        <w:t xml:space="preserve">) em diferentes ambientes computacionais, bem como a comparação entre os modelos de aprendizado de máquina CART e </w:t>
-      </w:r>
-      <w:proofErr w:type="spellStart"/>
-      <w:r>
-        <w:rPr>
-          <w:rFonts w:eastAsia="Times New Roman" w:cs="Times New Roman"/>
-          <w:szCs w:val="24"/>
-          <w:highlight w:val="lightGray"/>
-          <w:lang w:eastAsia="pt-BR"/>
-        </w:rPr>
-        <w:t>Random</w:t>
-      </w:r>
-      <w:proofErr w:type="spellEnd"/>
-      <w:r>
-        <w:rPr>
-          <w:rFonts w:eastAsia="Times New Roman" w:cs="Times New Roman"/>
-          <w:szCs w:val="24"/>
-          <w:highlight w:val="lightGray"/>
-          <w:lang w:eastAsia="pt-BR"/>
-        </w:rPr>
-        <w:t xml:space="preserve"> Forest, com base nas métricas de avaliação preditiva e no tempo de execução. O Capítulo 5, Discussão, analisa os resultados obtidos, destacando os principais achados, interpretando as diferenças de desempenho entre os algoritmos e discutindo as variáveis mais relevantes para a predição dos desfechos clínicos. O Capítulo 6, Conclusão, resume os principais resultados do estudo, responde ao problema de pesquisa, apresenta as limitações encontradas e propõe sugestões para trabalhos futuros. Por fim, o Capítulo 7, Referências </w:t>
+        <w:t xml:space="preserve">Este Trabalho de Conclusão de Curso está estruturado em sete capítulos. O Capítulo 1, Introdução, apresenta o contexto da pesquisa, destacando a importância do uso de técnicas de ciência de dados na área da saúde, especialmente no enfrentamento da Síndrome Respiratória Aguda Grave (SRAG). Também define o problema de pesquisa, os objetivos geral e específicos, e a justificativa do estudo. O Capítulo 2, Revisão Bibliográfica, aborda os fundamentos teóricos relacionados à SRAG, ao processo de descoberta de conhecimento em bases de dados (KDD), às etapas de pré-processamento, às técnicas de análise de dados e aos principais algoritmos de aprendizado de máquina aplicados à predição de desfechos clínicos. O Capítulo 3, Metodologia, descreve os dados utilizados, o processo de pré-processamento, as ferramentas adotadas para a análise e implementação dos modelos, os ambientes computacionais utilizados para a execução dos algoritmos e os critérios adotados para avaliação de desempenho preditivo e computacional. O Capítulo 4, Resultados, apresenta os resultados obtidos na aplicação do algoritmo desenvolvido (real_collab) em diferentes ambientes computacionais, bem como a comparação entre os modelos de aprendizado de máquina CART e Random Forest, com base nas métricas de avaliação preditiva e no tempo de execução. O Capítulo 5, Discussão, analisa os resultados obtidos, destacando os principais achados, interpretando as diferenças de desempenho entre os algoritmos e discutindo as variáveis mais relevantes para a predição dos desfechos clínicos. O Capítulo 6, Conclusão, resume os principais resultados do estudo, responde ao problema de pesquisa, apresenta as limitações encontradas e propõe sugestões para trabalhos futuros. Por fim, o Capítulo 7, Referências </w:t>
       </w:r>
       <w:r>
         <w:rPr>
@@ -175,19 +88,11 @@
       </w:pPr>
       <w:bookmarkStart w:id="1" w:name="_Toc203431579"/>
       <w:commentRangeStart w:id="2"/>
-      <w:proofErr w:type="spellStart"/>
       <w:r>
         <w:rPr>
           <w:highlight w:val="yellow"/>
         </w:rPr>
-        <w:t>Random</w:t>
-      </w:r>
-      <w:proofErr w:type="spellEnd"/>
-      <w:r>
-        <w:rPr>
-          <w:highlight w:val="yellow"/>
-        </w:rPr>
-        <w:t xml:space="preserve"> Forest</w:t>
+        <w:t>Random Forest</w:t>
       </w:r>
       <w:bookmarkEnd w:id="1"/>
       <w:commentRangeEnd w:id="2"/>
@@ -213,202 +118,141 @@
       <w:r>
         <w:t xml:space="preserve">O algoritmo </w:t>
       </w:r>
-      <w:proofErr w:type="spellStart"/>
       <w:r>
         <w:rPr>
           <w:i/>
           <w:iCs/>
         </w:rPr>
-        <w:t>Random</w:t>
-      </w:r>
-      <w:proofErr w:type="spellEnd"/>
+        <w:t>Random Forest</w:t>
+      </w:r>
+      <w:r>
+        <w:t xml:space="preserve"> (traduzido para Floresta Aleatória) é uma técnica baseada em um conjunto de árvores de decisão, sendo eficaz para problemas de classificação, previsão e regressão. Estudos indicam que esse método tem alto desempenho na predição de desfechos clínicos (Belini, Ataide e Lochter, 2024). Através dele é possível melhorar a precisão e reduzir o</w:t>
+      </w:r>
       <w:r>
         <w:rPr>
           <w:i/>
           <w:iCs/>
         </w:rPr>
-        <w:t xml:space="preserve"> Forest</w:t>
-      </w:r>
-      <w:r>
-        <w:t xml:space="preserve"> (traduzido para Floresta Aleatória) é uma técnica baseada em um conjunto de árvores de decisão, sendo eficaz para problemas de classificação, previsão e regressão. Estudos indicam que esse método tem alto desempenho na predição de desfechos clínicos (</w:t>
-      </w:r>
-      <w:proofErr w:type="spellStart"/>
-      <w:r>
-        <w:t>Belini</w:t>
-      </w:r>
-      <w:proofErr w:type="spellEnd"/>
-      <w:r>
-        <w:t xml:space="preserve">, </w:t>
-      </w:r>
-      <w:proofErr w:type="spellStart"/>
-      <w:r>
-        <w:t>Ataide</w:t>
-      </w:r>
-      <w:proofErr w:type="spellEnd"/>
-      <w:r>
-        <w:t xml:space="preserve"> e </w:t>
-      </w:r>
-      <w:proofErr w:type="spellStart"/>
-      <w:r>
-        <w:t>Lochter</w:t>
-      </w:r>
-      <w:proofErr w:type="spellEnd"/>
-      <w:r>
-        <w:t>, 2024). Através dele é possível melhorar a precisão e reduzir o</w:t>
+        <w:t xml:space="preserve"> </w:t>
       </w:r>
       <w:r>
         <w:rPr>
           <w:i/>
           <w:iCs/>
         </w:rPr>
+        <w:t>overfitting</w:t>
+      </w:r>
+      <w:r>
+        <w:rPr>
+          <w:rStyle w:val="Refdenotaderodap"/>
+        </w:rPr>
+        <w:footnoteReference w:id="1"/>
+      </w:r>
+      <w:r>
+        <w:t>, como por exemplo na previsão de uma espécie de uma flor com base em suas características.</w:t>
+      </w:r>
+    </w:p>
+    <w:p>
+      <w:pPr>
+        <w:rPr>
+          <w:b/>
+          <w:bCs/>
+        </w:rPr>
+      </w:pPr>
+    </w:p>
+    <w:p>
+      <w:pPr>
+        <w:pStyle w:val="Ttulo2"/>
+        <w:rPr>
+          <w:highlight w:val="red"/>
+          <w:lang w:val="pt-BR"/>
+        </w:rPr>
+      </w:pPr>
+      <w:bookmarkStart w:id="3" w:name="_Toc203566813"/>
+      <w:r>
+        <w:rPr>
+          <w:highlight w:val="yellow"/>
+          <w:lang w:val="pt-BR"/>
+        </w:rPr>
+        <w:t>Árvore de Decisão</w:t>
+      </w:r>
+      <w:bookmarkEnd w:id="3"/>
+      <w:r>
+        <w:rPr>
+          <w:highlight w:val="yellow"/>
+          <w:lang w:val="pt-BR"/>
+        </w:rPr>
         <w:t xml:space="preserve"> </w:t>
       </w:r>
-      <w:proofErr w:type="spellStart"/>
+      <w:r>
+        <w:rPr>
+          <w:highlight w:val="red"/>
+          <w:lang w:val="pt-BR"/>
+        </w:rPr>
+        <w:t>[procurar um artigo]</w:t>
+      </w:r>
+    </w:p>
+    <w:p>
+      <w:pPr>
+        <w:pStyle w:val="Ttulo3"/>
+        <w:rPr>
+          <w:bCs/>
+          <w:lang w:val="pt-BR"/>
+        </w:rPr>
+      </w:pPr>
+      <w:bookmarkStart w:id="4" w:name="_Toc203566814"/>
+      <w:r>
+        <w:rPr>
+          <w:lang w:val="pt-BR"/>
+        </w:rPr>
+        <w:t>Conceito de Árvore de Decisão</w:t>
+      </w:r>
+      <w:bookmarkEnd w:id="4"/>
+    </w:p>
+    <w:p>
+      <w:pPr>
+        <w:spacing w:line="240" w:lineRule="auto"/>
+        <w:textAlignment w:val="baseline"/>
+      </w:pPr>
+      <w:r>
+        <w:t xml:space="preserve">Como </w:t>
+      </w:r>
+      <w:r>
+        <w:t>Á</w:t>
+      </w:r>
+      <w:r>
+        <w:t xml:space="preserve">rvore de </w:t>
+      </w:r>
+      <w:r>
+        <w:t>D</w:t>
+      </w:r>
+      <w:r>
+        <w:t xml:space="preserve">ecisão </w:t>
+      </w:r>
+      <w:r>
+        <w:t>(em inglês</w:t>
+      </w:r>
+      <w:r>
+        <w:t xml:space="preserve"> </w:t>
+      </w:r>
       <w:r>
         <w:rPr>
           <w:i/>
           <w:iCs/>
         </w:rPr>
-        <w:t>overfitting</w:t>
-      </w:r>
-      <w:proofErr w:type="spellEnd"/>
-      <w:r>
-        <w:rPr>
-          <w:rStyle w:val="Refdenotaderodap"/>
-        </w:rPr>
-        <w:footnoteReference w:id="1"/>
-      </w:r>
-      <w:r>
-        <w:t>, como por exemplo na previsão de uma espécie de uma flor com base em suas características.</w:t>
-      </w:r>
-    </w:p>
-    <w:p>
-      <w:pPr>
-        <w:rPr>
-          <w:b/>
-          <w:bCs/>
-        </w:rPr>
-      </w:pPr>
-    </w:p>
-    <w:p>
-      <w:pPr>
-        <w:pStyle w:val="Ttulo2"/>
-        <w:rPr>
-          <w:highlight w:val="red"/>
-          <w:lang w:val="pt-BR"/>
-        </w:rPr>
-      </w:pPr>
-      <w:bookmarkStart w:id="3" w:name="_Toc203566813"/>
-      <w:r>
-        <w:rPr>
-          <w:highlight w:val="yellow"/>
-          <w:lang w:val="pt-BR"/>
-        </w:rPr>
-        <w:t>Árvore de Decisão</w:t>
-      </w:r>
-      <w:bookmarkEnd w:id="3"/>
-      <w:r>
-        <w:rPr>
-          <w:highlight w:val="yellow"/>
-          <w:lang w:val="pt-BR"/>
-        </w:rPr>
-        <w:t xml:space="preserve"> </w:t>
-      </w:r>
-      <w:r>
-        <w:rPr>
-          <w:highlight w:val="red"/>
-          <w:lang w:val="pt-BR"/>
-        </w:rPr>
-        <w:t>[procurar um artigo]</w:t>
-      </w:r>
-    </w:p>
-    <w:p>
-      <w:pPr>
-        <w:pStyle w:val="Ttulo3"/>
-        <w:rPr>
-          <w:bCs/>
-          <w:lang w:val="pt-BR"/>
-        </w:rPr>
-      </w:pPr>
-      <w:bookmarkStart w:id="4" w:name="_Toc203566814"/>
-      <w:r>
-        <w:rPr>
-          <w:lang w:val="pt-BR"/>
-        </w:rPr>
-        <w:t>Conceito de Árvore de Decisão</w:t>
-      </w:r>
-      <w:bookmarkEnd w:id="4"/>
+        <w:t>Decision Tree</w:t>
+      </w:r>
+      <w:r>
+        <w:t xml:space="preserve">) </w:t>
+      </w:r>
+      <w:r>
+        <w:t>é um algoritmo de aprendizado de máquina e ao mesmo tempo uma técnica de mineração de dados, utilizada para prever, classificar e extrair conhecimento a partir de dados foi criada esta seção para detalhar sua aplicação e importância. Pode-se dizer que as Árvores de Decisão são modelos hierárquicos que segmentam os dados com base em condições lógicas sucessivas. Elas são eficientes e interpretáveis para tarefas de classificação e regressão, sendo frequentemente utilizadas em conjunto com outros métodos para aumentar a robustez dos modelos (Silva e Silva Neto, 2022).</w:t>
+      </w:r>
     </w:p>
     <w:p>
       <w:pPr>
         <w:spacing w:line="240" w:lineRule="auto"/>
         <w:textAlignment w:val="baseline"/>
-      </w:pPr>
-      <w:r>
-        <w:t xml:space="preserve">Como </w:t>
-      </w:r>
-      <w:r>
-        <w:t>Á</w:t>
-      </w:r>
-      <w:r>
-        <w:t xml:space="preserve">rvore de </w:t>
-      </w:r>
-      <w:r>
-        <w:t>D</w:t>
-      </w:r>
-      <w:r>
-        <w:t xml:space="preserve">ecisão </w:t>
-      </w:r>
-      <w:r>
-        <w:t>(em inglês</w:t>
-      </w:r>
-      <w:r>
-        <w:t xml:space="preserve"> </w:t>
-      </w:r>
-      <w:proofErr w:type="spellStart"/>
-      <w:r>
-        <w:rPr>
-          <w:i/>
-          <w:iCs/>
-        </w:rPr>
-        <w:t>Decision</w:t>
-      </w:r>
-      <w:proofErr w:type="spellEnd"/>
-      <w:r>
-        <w:rPr>
-          <w:i/>
-          <w:iCs/>
-        </w:rPr>
-        <w:t xml:space="preserve"> </w:t>
-      </w:r>
-      <w:proofErr w:type="spellStart"/>
-      <w:r>
-        <w:rPr>
-          <w:i/>
-          <w:iCs/>
-        </w:rPr>
-        <w:t>Tree</w:t>
-      </w:r>
-      <w:proofErr w:type="spellEnd"/>
-      <w:r>
-        <w:t xml:space="preserve">) </w:t>
-      </w:r>
-      <w:r>
-        <w:t xml:space="preserve">é um algoritmo de aprendizado de máquina e ao mesmo tempo uma técnica de mineração de dados, utilizada para prever, classificar e extrair conhecimento a partir de dados foi criada esta seção para detalhar sua aplicação e importância. Pode-se dizer que as Árvores de Decisão são modelos hierárquicos que segmentam os dados com base em condições lógicas sucessivas. Elas são </w:t>
-      </w:r>
-      <w:proofErr w:type="gramStart"/>
-      <w:r>
-        <w:t>eficientes e interpretáveis</w:t>
-      </w:r>
-      <w:proofErr w:type="gramEnd"/>
-      <w:r>
-        <w:t xml:space="preserve"> para tarefas de classificação e regressão, sendo frequentemente utilizadas em conjunto com outros métodos para aumentar a robustez dos modelos (Silva e Silva Neto, 2022).</w:t>
-      </w:r>
-    </w:p>
-    <w:p>
-      <w:pPr>
-        <w:spacing w:line="240" w:lineRule="auto"/>
-        <w:textAlignment w:val="baseline"/>
         <w:rPr>
           <w:rFonts w:eastAsia="Times New Roman" w:hAnsi="Symbol" w:cs="Times New Roman"/>
           <w:szCs w:val="24"/>
@@ -480,21 +324,7 @@
         <w:rPr>
           <w:highlight w:val="lightGray"/>
         </w:rPr>
-        <w:t xml:space="preserve">A escolha das divisões nos nós é feita com base em critérios de pureza, que indicam o quão </w:t>
-      </w:r>
-      <w:proofErr w:type="spellStart"/>
-      <w:r>
-        <w:rPr>
-          <w:highlight w:val="lightGray"/>
-        </w:rPr>
-        <w:t>homogênios</w:t>
-      </w:r>
-      <w:proofErr w:type="spellEnd"/>
-      <w:r>
-        <w:rPr>
-          <w:highlight w:val="lightGray"/>
-        </w:rPr>
-        <w:t xml:space="preserve"> os grupos resultantes serão após a divisão. Os critérios mais utilizados são:</w:t>
+        <w:t>A escolha das divisões nos nós é feita com base em critérios de pureza, que indicam o quão homogênios os grupos resultantes serão após a divisão. Os critérios mais utilizados são:</w:t>
       </w:r>
     </w:p>
     <w:p>
@@ -611,21 +441,7 @@
         <w:rPr>
           <w:highlight w:val="lightGray"/>
         </w:rPr>
-        <w:t xml:space="preserve">: por seguir uma lógica sequencial, é possível entender claramente como o modelo chegou </w:t>
-      </w:r>
-      <w:proofErr w:type="gramStart"/>
-      <w:r>
-        <w:rPr>
-          <w:highlight w:val="lightGray"/>
-        </w:rPr>
-        <w:t>a</w:t>
-      </w:r>
-      <w:proofErr w:type="gramEnd"/>
-      <w:r>
-        <w:rPr>
-          <w:highlight w:val="lightGray"/>
-        </w:rPr>
-        <w:t xml:space="preserve"> determinada decisão.</w:t>
+        <w:t>: por seguir uma lógica sequencial, é possível entender claramente como o modelo chegou a determinada decisão.</w:t>
       </w:r>
     </w:p>
     <w:p>
@@ -721,17 +537,8 @@
           <w:rStyle w:val="Forte"/>
           <w:highlight w:val="lightGray"/>
         </w:rPr>
-        <w:t xml:space="preserve">Tendência ao </w:t>
-      </w:r>
-      <w:proofErr w:type="spellStart"/>
-      <w:r>
-        <w:rPr>
-          <w:rStyle w:val="Forte"/>
-          <w:highlight w:val="lightGray"/>
-        </w:rPr>
-        <w:t>overfitting</w:t>
-      </w:r>
-      <w:proofErr w:type="spellEnd"/>
+        <w:t>Tendência ao overfitting</w:t>
+      </w:r>
       <w:r>
         <w:rPr>
           <w:highlight w:val="lightGray"/>
@@ -786,35 +593,7 @@
         <w:rPr>
           <w:highlight w:val="lightGray"/>
         </w:rPr>
-        <w:t>: como ensembles (</w:t>
-      </w:r>
-      <w:proofErr w:type="spellStart"/>
-      <w:r>
-        <w:rPr>
-          <w:highlight w:val="lightGray"/>
-        </w:rPr>
-        <w:t>ex</w:t>
-      </w:r>
-      <w:proofErr w:type="spellEnd"/>
-      <w:r>
-        <w:rPr>
-          <w:highlight w:val="lightGray"/>
-        </w:rPr>
-        <w:t xml:space="preserve">: </w:t>
-      </w:r>
-      <w:proofErr w:type="spellStart"/>
-      <w:r>
-        <w:rPr>
-          <w:highlight w:val="lightGray"/>
-        </w:rPr>
-        <w:t>Random</w:t>
-      </w:r>
-      <w:proofErr w:type="spellEnd"/>
-      <w:r>
-        <w:rPr>
-          <w:highlight w:val="lightGray"/>
-        </w:rPr>
-        <w:t xml:space="preserve"> Forest), principalmente quando há muitos ruídos nos dados.</w:t>
+        <w:t>: como ensembles (ex: Random Forest), principalmente quando há muitos ruídos nos dados.</w:t>
       </w:r>
     </w:p>
     <w:p>
@@ -866,78 +645,14 @@
           <w:highlight w:val="yellow"/>
           <w:lang w:val="pt-BR"/>
         </w:rPr>
-        <w:t>Algoritmo CART (</w:t>
-      </w:r>
-      <w:proofErr w:type="spellStart"/>
+        <w:t>Algoritmo CART (Classification and Regression Trees)</w:t>
+      </w:r>
+      <w:bookmarkEnd w:id="5"/>
       <w:r>
         <w:rPr>
           <w:highlight w:val="yellow"/>
           <w:lang w:val="pt-BR"/>
         </w:rPr>
-        <w:t>Classification</w:t>
-      </w:r>
-      <w:proofErr w:type="spellEnd"/>
-      <w:r>
-        <w:rPr>
-          <w:highlight w:val="yellow"/>
-          <w:lang w:val="pt-BR"/>
-        </w:rPr>
-        <w:t xml:space="preserve"> </w:t>
-      </w:r>
-      <w:proofErr w:type="spellStart"/>
-      <w:r>
-        <w:rPr>
-          <w:highlight w:val="yellow"/>
-          <w:lang w:val="pt-BR"/>
-        </w:rPr>
-        <w:t>and</w:t>
-      </w:r>
-      <w:proofErr w:type="spellEnd"/>
-      <w:r>
-        <w:rPr>
-          <w:highlight w:val="yellow"/>
-          <w:lang w:val="pt-BR"/>
-        </w:rPr>
-        <w:t xml:space="preserve"> </w:t>
-      </w:r>
-      <w:proofErr w:type="spellStart"/>
-      <w:r>
-        <w:rPr>
-          <w:highlight w:val="yellow"/>
-          <w:lang w:val="pt-BR"/>
-        </w:rPr>
-        <w:t>Regression</w:t>
-      </w:r>
-      <w:proofErr w:type="spellEnd"/>
-      <w:r>
-        <w:rPr>
-          <w:highlight w:val="yellow"/>
-          <w:lang w:val="pt-BR"/>
-        </w:rPr>
-        <w:t xml:space="preserve"> </w:t>
-      </w:r>
-      <w:proofErr w:type="spellStart"/>
-      <w:r>
-        <w:rPr>
-          <w:highlight w:val="yellow"/>
-          <w:lang w:val="pt-BR"/>
-        </w:rPr>
-        <w:t>Trees</w:t>
-      </w:r>
-      <w:proofErr w:type="spellEnd"/>
-      <w:r>
-        <w:rPr>
-          <w:highlight w:val="yellow"/>
-          <w:lang w:val="pt-BR"/>
-        </w:rPr>
-        <w:t>)</w:t>
-      </w:r>
-      <w:bookmarkEnd w:id="5"/>
-      <w:r>
-        <w:rPr>
-          <w:highlight w:val="yellow"/>
-          <w:lang w:val="pt-BR"/>
-        </w:rPr>
         <w:t xml:space="preserve"> </w:t>
       </w:r>
       <w:r>
@@ -977,132 +692,16 @@
           <w:highlight w:val="lightGray"/>
           <w:lang w:eastAsia="pt-BR"/>
         </w:rPr>
-        <w:t>CART (</w:t>
-      </w:r>
-      <w:proofErr w:type="spellStart"/>
-      <w:r>
-        <w:rPr>
-          <w:rFonts w:eastAsia="Times New Roman" w:cs="Times New Roman"/>
-          <w:b/>
-          <w:bCs/>
-          <w:szCs w:val="24"/>
-          <w:highlight w:val="lightGray"/>
-          <w:lang w:eastAsia="pt-BR"/>
-        </w:rPr>
-        <w:t>Classification</w:t>
-      </w:r>
-      <w:proofErr w:type="spellEnd"/>
-      <w:r>
-        <w:rPr>
-          <w:rFonts w:eastAsia="Times New Roman" w:cs="Times New Roman"/>
-          <w:b/>
-          <w:bCs/>
-          <w:szCs w:val="24"/>
-          <w:highlight w:val="lightGray"/>
-          <w:lang w:eastAsia="pt-BR"/>
-        </w:rPr>
-        <w:t xml:space="preserve"> </w:t>
-      </w:r>
-      <w:proofErr w:type="spellStart"/>
-      <w:r>
-        <w:rPr>
-          <w:rFonts w:eastAsia="Times New Roman" w:cs="Times New Roman"/>
-          <w:b/>
-          <w:bCs/>
-          <w:szCs w:val="24"/>
-          <w:highlight w:val="lightGray"/>
-          <w:lang w:eastAsia="pt-BR"/>
-        </w:rPr>
-        <w:t>and</w:t>
-      </w:r>
-      <w:proofErr w:type="spellEnd"/>
-      <w:r>
-        <w:rPr>
-          <w:rFonts w:eastAsia="Times New Roman" w:cs="Times New Roman"/>
-          <w:b/>
-          <w:bCs/>
-          <w:szCs w:val="24"/>
-          <w:highlight w:val="lightGray"/>
-          <w:lang w:eastAsia="pt-BR"/>
-        </w:rPr>
-        <w:t xml:space="preserve"> </w:t>
-      </w:r>
-      <w:proofErr w:type="spellStart"/>
-      <w:r>
-        <w:rPr>
-          <w:rFonts w:eastAsia="Times New Roman" w:cs="Times New Roman"/>
-          <w:b/>
-          <w:bCs/>
-          <w:szCs w:val="24"/>
-          <w:highlight w:val="lightGray"/>
-          <w:lang w:eastAsia="pt-BR"/>
-        </w:rPr>
-        <w:t>Regression</w:t>
-      </w:r>
-      <w:proofErr w:type="spellEnd"/>
-      <w:r>
-        <w:rPr>
-          <w:rFonts w:eastAsia="Times New Roman" w:cs="Times New Roman"/>
-          <w:b/>
-          <w:bCs/>
-          <w:szCs w:val="24"/>
-          <w:highlight w:val="lightGray"/>
-          <w:lang w:eastAsia="pt-BR"/>
-        </w:rPr>
-        <w:t xml:space="preserve"> </w:t>
-      </w:r>
-      <w:proofErr w:type="spellStart"/>
-      <w:r>
-        <w:rPr>
-          <w:rFonts w:eastAsia="Times New Roman" w:cs="Times New Roman"/>
-          <w:b/>
-          <w:bCs/>
-          <w:szCs w:val="24"/>
-          <w:highlight w:val="lightGray"/>
-          <w:lang w:eastAsia="pt-BR"/>
-        </w:rPr>
-        <w:t>Trees</w:t>
-      </w:r>
-      <w:proofErr w:type="spellEnd"/>
-      <w:r>
-        <w:rPr>
-          <w:rFonts w:eastAsia="Times New Roman" w:cs="Times New Roman"/>
-          <w:b/>
-          <w:bCs/>
-          <w:szCs w:val="24"/>
-          <w:highlight w:val="lightGray"/>
-          <w:lang w:eastAsia="pt-BR"/>
-        </w:rPr>
-        <w:t>)</w:t>
-      </w:r>
-      <w:r>
-        <w:rPr>
-          <w:rFonts w:eastAsia="Times New Roman" w:cs="Times New Roman"/>
-          <w:szCs w:val="24"/>
-          <w:highlight w:val="lightGray"/>
-          <w:lang w:eastAsia="pt-BR"/>
-        </w:rPr>
-        <w:t xml:space="preserve"> é uma metodologia clássica desenvolvida por </w:t>
-      </w:r>
-      <w:proofErr w:type="spellStart"/>
-      <w:r>
-        <w:rPr>
-          <w:rFonts w:eastAsia="Times New Roman" w:cs="Times New Roman"/>
-          <w:szCs w:val="24"/>
-          <w:highlight w:val="lightGray"/>
-          <w:lang w:eastAsia="pt-BR"/>
-        </w:rPr>
-        <w:t>Breiman</w:t>
-      </w:r>
-      <w:proofErr w:type="spellEnd"/>
-      <w:r>
-        <w:rPr>
-          <w:rFonts w:eastAsia="Times New Roman" w:cs="Times New Roman"/>
-          <w:szCs w:val="24"/>
-          <w:highlight w:val="lightGray"/>
-          <w:lang w:eastAsia="pt-BR"/>
-        </w:rPr>
-        <w:t xml:space="preserve"> et al. em 1986, amplamente utilizada para construção de árvores de decisão tanto para tarefas de </w:t>
+        <w:t>CART (Classification and Regression Trees)</w:t>
+      </w:r>
+      <w:r>
+        <w:rPr>
+          <w:rFonts w:eastAsia="Times New Roman" w:cs="Times New Roman"/>
+          <w:szCs w:val="24"/>
+          <w:highlight w:val="lightGray"/>
+          <w:lang w:eastAsia="pt-BR"/>
+        </w:rPr>
+        <w:t xml:space="preserve"> é uma metodologia clássica desenvolvida por Breiman et al. em 1986, amplamente utilizada para construção de árvores de decisão tanto para tarefas de </w:t>
       </w:r>
       <w:r>
         <w:rPr>
@@ -1887,7 +1486,6 @@
         </w:rPr>
         <w:t>poda (</w:t>
       </w:r>
-      <w:proofErr w:type="spellStart"/>
       <w:r>
         <w:rPr>
           <w:rFonts w:eastAsia="Times New Roman" w:cs="Times New Roman"/>
@@ -1901,7 +1499,6 @@
         </w:rPr>
         <w:t>pruning</w:t>
       </w:r>
-      <w:proofErr w:type="spellEnd"/>
       <w:r>
         <w:rPr>
           <w:rFonts w:eastAsia="Times New Roman" w:cs="Times New Roman"/>
@@ -1922,7 +1519,6 @@
         </w:rPr>
         <w:t xml:space="preserve">, com o objetivo de reduzir o </w:t>
       </w:r>
-      <w:proofErr w:type="spellStart"/>
       <w:r>
         <w:rPr>
           <w:rFonts w:eastAsia="Times New Roman" w:cs="Times New Roman"/>
@@ -1934,7 +1530,6 @@
         </w:rPr>
         <w:t>overfitting</w:t>
       </w:r>
-      <w:proofErr w:type="spellEnd"/>
       <w:r>
         <w:rPr>
           <w:rFonts w:eastAsia="Times New Roman" w:cs="Times New Roman"/>
@@ -2382,27 +1977,7 @@
           <w:highlight w:val="lightGray"/>
           <w:lang w:eastAsia="pt-BR"/>
         </w:rPr>
-        <w:t xml:space="preserve">, podendo gerar árvores diferentes com </w:t>
-      </w:r>
-      <w:proofErr w:type="spellStart"/>
-      <w:r>
-        <w:rPr>
-          <w:rFonts w:eastAsia="Times New Roman" w:cs="Times New Roman"/>
-          <w:szCs w:val="24"/>
-          <w:highlight w:val="lightGray"/>
-          <w:lang w:eastAsia="pt-BR"/>
-        </w:rPr>
-        <w:t>datasets</w:t>
-      </w:r>
-      <w:proofErr w:type="spellEnd"/>
-      <w:r>
-        <w:rPr>
-          <w:rFonts w:eastAsia="Times New Roman" w:cs="Times New Roman"/>
-          <w:szCs w:val="24"/>
-          <w:highlight w:val="lightGray"/>
-          <w:lang w:eastAsia="pt-BR"/>
-        </w:rPr>
-        <w:t xml:space="preserve"> similares;</w:t>
+        <w:t>, podendo gerar árvores diferentes com datasets similares;</w:t>
       </w:r>
     </w:p>
     <w:p>
@@ -2429,21 +2004,8 @@
           <w:highlight w:val="lightGray"/>
           <w:lang w:eastAsia="pt-BR"/>
         </w:rPr>
-        <w:t xml:space="preserve">Propensão ao </w:t>
-      </w:r>
-      <w:proofErr w:type="spellStart"/>
-      <w:r>
-        <w:rPr>
-          <w:rFonts w:eastAsia="Times New Roman" w:cs="Times New Roman"/>
-          <w:b/>
-          <w:bCs/>
-          <w:szCs w:val="24"/>
-          <w:highlight w:val="lightGray"/>
-          <w:lang w:eastAsia="pt-BR"/>
-        </w:rPr>
-        <w:t>overfitting</w:t>
-      </w:r>
-      <w:proofErr w:type="spellEnd"/>
+        <w:t>Propensão ao overfitting</w:t>
+      </w:r>
       <w:r>
         <w:rPr>
           <w:rFonts w:eastAsia="Times New Roman" w:cs="Times New Roman"/>
@@ -2487,47 +2049,7 @@
           <w:highlight w:val="lightGray"/>
           <w:lang w:eastAsia="pt-BR"/>
         </w:rPr>
-        <w:t xml:space="preserve"> em relação a métodos ensemble como </w:t>
-      </w:r>
-      <w:proofErr w:type="spellStart"/>
-      <w:r>
-        <w:rPr>
-          <w:rFonts w:eastAsia="Times New Roman" w:cs="Times New Roman"/>
-          <w:szCs w:val="24"/>
-          <w:highlight w:val="lightGray"/>
-          <w:lang w:eastAsia="pt-BR"/>
-        </w:rPr>
-        <w:t>Random</w:t>
-      </w:r>
-      <w:proofErr w:type="spellEnd"/>
-      <w:r>
-        <w:rPr>
-          <w:rFonts w:eastAsia="Times New Roman" w:cs="Times New Roman"/>
-          <w:szCs w:val="24"/>
-          <w:highlight w:val="lightGray"/>
-          <w:lang w:eastAsia="pt-BR"/>
-        </w:rPr>
-        <w:t xml:space="preserve"> Forest ou </w:t>
-      </w:r>
-      <w:proofErr w:type="spellStart"/>
-      <w:r>
-        <w:rPr>
-          <w:rFonts w:eastAsia="Times New Roman" w:cs="Times New Roman"/>
-          <w:szCs w:val="24"/>
-          <w:highlight w:val="lightGray"/>
-          <w:lang w:eastAsia="pt-BR"/>
-        </w:rPr>
-        <w:t>XGBoost</w:t>
-      </w:r>
-      <w:proofErr w:type="spellEnd"/>
-      <w:r>
-        <w:rPr>
-          <w:rFonts w:eastAsia="Times New Roman" w:cs="Times New Roman"/>
-          <w:szCs w:val="24"/>
-          <w:highlight w:val="lightGray"/>
-          <w:lang w:eastAsia="pt-BR"/>
-        </w:rPr>
-        <w:t>.</w:t>
+        <w:t xml:space="preserve"> em relação a métodos ensemble como Random Forest ou XGBoost.</w:t>
       </w:r>
     </w:p>
     <w:p>
@@ -2558,21 +2080,8 @@
           <w:highlight w:val="lightGray"/>
           <w:lang w:eastAsia="pt-BR"/>
         </w:rPr>
-        <w:t xml:space="preserve">transparência e </w:t>
-      </w:r>
-      <w:proofErr w:type="spellStart"/>
-      <w:r>
-        <w:rPr>
-          <w:rFonts w:eastAsia="Times New Roman" w:cs="Times New Roman"/>
-          <w:b/>
-          <w:bCs/>
-          <w:szCs w:val="24"/>
-          <w:highlight w:val="lightGray"/>
-          <w:lang w:eastAsia="pt-BR"/>
-        </w:rPr>
-        <w:t>explicabilidade</w:t>
-      </w:r>
-      <w:proofErr w:type="spellEnd"/>
+        <w:t>transparência e explicabilidade</w:t>
+      </w:r>
       <w:r>
         <w:rPr>
           <w:rFonts w:eastAsia="Times New Roman" w:cs="Times New Roman"/>
@@ -2640,21 +2149,12 @@
         </w:rPr>
         <w:t xml:space="preserve"> </w:t>
       </w:r>
-      <w:proofErr w:type="gramStart"/>
       <w:r>
         <w:rPr>
           <w:highlight w:val="yellow"/>
           <w:lang w:val="pt-BR"/>
         </w:rPr>
-        <w:t>[Verificar</w:t>
-      </w:r>
-      <w:proofErr w:type="gramEnd"/>
-      <w:r>
-        <w:rPr>
-          <w:highlight w:val="yellow"/>
-          <w:lang w:val="pt-BR"/>
-        </w:rPr>
-        <w:t xml:space="preserve"> um artigo]</w:t>
+        <w:t>[Verificar um artigo]</w:t>
       </w:r>
     </w:p>
     <w:p>
@@ -2724,7 +2224,6 @@
           <w:highlight w:val="lightGray"/>
         </w:rPr>
       </w:pPr>
-      <w:proofErr w:type="spellStart"/>
       <w:r>
         <w:rPr>
           <w:rStyle w:val="Forte"/>
@@ -2732,29 +2231,8 @@
           <w:bCs w:val="0"/>
           <w:highlight w:val="lightGray"/>
         </w:rPr>
-        <w:t>Matriz</w:t>
-      </w:r>
-      <w:proofErr w:type="spellEnd"/>
-      <w:r>
-        <w:rPr>
-          <w:rStyle w:val="Forte"/>
-          <w:b/>
-          <w:bCs w:val="0"/>
-          <w:highlight w:val="lightGray"/>
-        </w:rPr>
-        <w:t xml:space="preserve"> de </w:t>
-      </w:r>
-      <w:proofErr w:type="spellStart"/>
-      <w:r>
-        <w:rPr>
-          <w:rStyle w:val="Forte"/>
-          <w:b/>
-          <w:bCs w:val="0"/>
-          <w:highlight w:val="lightGray"/>
-        </w:rPr>
-        <w:t>Confusão</w:t>
-      </w:r>
-      <w:proofErr w:type="spellEnd"/>
+        <w:t>Matriz de Confusão</w:t>
+      </w:r>
     </w:p>
     <w:p>
       <w:pPr>
@@ -3066,7 +2544,6 @@
           <w:highlight w:val="lightGray"/>
         </w:rPr>
       </w:pPr>
-      <w:proofErr w:type="spellStart"/>
       <w:r>
         <w:rPr>
           <w:rStyle w:val="Forte"/>
@@ -3076,7 +2553,6 @@
         </w:rPr>
         <w:t>Acurácia</w:t>
       </w:r>
-      <w:proofErr w:type="spellEnd"/>
     </w:p>
     <w:p>
       <w:pPr>
@@ -3294,7 +2770,6 @@
           <w:highlight w:val="lightGray"/>
         </w:rPr>
       </w:pPr>
-      <w:proofErr w:type="spellStart"/>
       <w:r>
         <w:rPr>
           <w:rStyle w:val="Forte"/>
@@ -3302,17 +2777,7 @@
           <w:bCs w:val="0"/>
           <w:highlight w:val="lightGray"/>
         </w:rPr>
-        <w:t>Precisão</w:t>
-      </w:r>
-      <w:proofErr w:type="spellEnd"/>
-      <w:r>
-        <w:rPr>
-          <w:rStyle w:val="Forte"/>
-          <w:b/>
-          <w:bCs w:val="0"/>
-          <w:highlight w:val="lightGray"/>
-        </w:rPr>
-        <w:t xml:space="preserve"> (Precision)</w:t>
+        <w:t>Precisão (Precision)</w:t>
       </w:r>
     </w:p>
     <w:p>
@@ -3512,7 +2977,6 @@
           <w:highlight w:val="lightGray"/>
         </w:rPr>
       </w:pPr>
-      <w:proofErr w:type="spellStart"/>
       <w:r>
         <w:rPr>
           <w:rStyle w:val="Forte"/>
@@ -3521,57 +2985,7 @@
           <w:highlight w:val="lightGray"/>
         </w:rPr>
         <w:lastRenderedPageBreak/>
-        <w:t>Revocação</w:t>
-      </w:r>
-      <w:proofErr w:type="spellEnd"/>
-      <w:r>
-        <w:rPr>
-          <w:rStyle w:val="Forte"/>
-          <w:b/>
-          <w:bCs w:val="0"/>
-          <w:highlight w:val="lightGray"/>
-        </w:rPr>
-        <w:t xml:space="preserve"> (Recall </w:t>
-      </w:r>
-      <w:proofErr w:type="spellStart"/>
-      <w:r>
-        <w:rPr>
-          <w:rStyle w:val="Forte"/>
-          <w:b/>
-          <w:bCs w:val="0"/>
-          <w:highlight w:val="lightGray"/>
-        </w:rPr>
-        <w:t>ou</w:t>
-      </w:r>
-      <w:proofErr w:type="spellEnd"/>
-      <w:r>
-        <w:rPr>
-          <w:rStyle w:val="Forte"/>
-          <w:b/>
-          <w:bCs w:val="0"/>
-          <w:highlight w:val="lightGray"/>
-        </w:rPr>
-        <w:t xml:space="preserve"> </w:t>
-      </w:r>
-      <w:proofErr w:type="spellStart"/>
-      <w:r>
-        <w:rPr>
-          <w:rStyle w:val="Forte"/>
-          <w:b/>
-          <w:bCs w:val="0"/>
-          <w:highlight w:val="lightGray"/>
-        </w:rPr>
-        <w:t>Sensibilidade</w:t>
-      </w:r>
-      <w:proofErr w:type="spellEnd"/>
-      <w:r>
-        <w:rPr>
-          <w:rStyle w:val="Forte"/>
-          <w:b/>
-          <w:bCs w:val="0"/>
-          <w:highlight w:val="lightGray"/>
-        </w:rPr>
-        <w:t>)</w:t>
+        <w:t>Revocação (Recall ou Sensibilidade)</w:t>
       </w:r>
     </w:p>
     <w:p>
@@ -3741,21 +3155,7 @@
         <w:rPr>
           <w:highlight w:val="lightGray"/>
         </w:rPr>
-        <w:t xml:space="preserve">Alta </w:t>
-      </w:r>
-      <w:proofErr w:type="spellStart"/>
-      <w:r>
-        <w:rPr>
-          <w:highlight w:val="lightGray"/>
-        </w:rPr>
-        <w:t>revocação</w:t>
-      </w:r>
-      <w:proofErr w:type="spellEnd"/>
-      <w:r>
-        <w:rPr>
-          <w:highlight w:val="lightGray"/>
-        </w:rPr>
-        <w:t xml:space="preserve"> é essencial em contextos clínicos, pois significa que o modelo consegue </w:t>
+        <w:t xml:space="preserve">Alta revocação é essencial em contextos clínicos, pois significa que o modelo consegue </w:t>
       </w:r>
       <w:r>
         <w:rPr>
@@ -4030,49 +3430,7 @@
         <w:rPr>
           <w:highlight w:val="lightGray"/>
         </w:rPr>
-        <w:t>A curva ROC (</w:t>
-      </w:r>
-      <w:proofErr w:type="spellStart"/>
-      <w:r>
-        <w:rPr>
-          <w:highlight w:val="lightGray"/>
-        </w:rPr>
-        <w:t>Receiver</w:t>
-      </w:r>
-      <w:proofErr w:type="spellEnd"/>
-      <w:r>
-        <w:rPr>
-          <w:highlight w:val="lightGray"/>
-        </w:rPr>
-        <w:t xml:space="preserve"> </w:t>
-      </w:r>
-      <w:proofErr w:type="spellStart"/>
-      <w:r>
-        <w:rPr>
-          <w:highlight w:val="lightGray"/>
-        </w:rPr>
-        <w:t>Operating</w:t>
-      </w:r>
-      <w:proofErr w:type="spellEnd"/>
-      <w:r>
-        <w:rPr>
-          <w:highlight w:val="lightGray"/>
-        </w:rPr>
-        <w:t xml:space="preserve"> </w:t>
-      </w:r>
-      <w:proofErr w:type="spellStart"/>
-      <w:r>
-        <w:rPr>
-          <w:highlight w:val="lightGray"/>
-        </w:rPr>
-        <w:t>Characteristic</w:t>
-      </w:r>
-      <w:proofErr w:type="spellEnd"/>
-      <w:r>
-        <w:rPr>
-          <w:highlight w:val="lightGray"/>
-        </w:rPr>
-        <w:t xml:space="preserve">) mostra a relação entre a taxa de verdadeiros positivos (Recall) e a taxa de falsos positivos (1 – Especificidade). A </w:t>
+        <w:t xml:space="preserve">A curva ROC (Receiver Operating Characteristic) mostra a relação entre a taxa de verdadeiros positivos (Recall) e a taxa de falsos positivos (1 – Especificidade). A </w:t>
       </w:r>
       <w:r>
         <w:rPr>
@@ -4270,7 +3628,6 @@
           <w:highlight w:val="lightGray"/>
         </w:rPr>
       </w:pPr>
-      <w:proofErr w:type="spellStart"/>
       <w:r>
         <w:rPr>
           <w:rStyle w:val="Forte"/>
@@ -4279,37 +3636,7 @@
           <w:highlight w:val="lightGray"/>
         </w:rPr>
         <w:lastRenderedPageBreak/>
-        <w:t>Funcionamento</w:t>
-      </w:r>
-      <w:proofErr w:type="spellEnd"/>
-      <w:r>
-        <w:rPr>
-          <w:rStyle w:val="Forte"/>
-          <w:b/>
-          <w:bCs w:val="0"/>
-          <w:highlight w:val="lightGray"/>
-        </w:rPr>
-        <w:t xml:space="preserve"> </w:t>
-      </w:r>
-      <w:proofErr w:type="spellStart"/>
-      <w:r>
-        <w:rPr>
-          <w:rStyle w:val="Forte"/>
-          <w:b/>
-          <w:bCs w:val="0"/>
-          <w:highlight w:val="lightGray"/>
-        </w:rPr>
-        <w:t>curva</w:t>
-      </w:r>
-      <w:proofErr w:type="spellEnd"/>
-      <w:r>
-        <w:rPr>
-          <w:rStyle w:val="Forte"/>
-          <w:b/>
-          <w:bCs w:val="0"/>
-          <w:highlight w:val="lightGray"/>
-        </w:rPr>
-        <w:t xml:space="preserve"> AUC</w:t>
+        <w:t>Funcionamento curva AUC</w:t>
       </w:r>
     </w:p>
     <w:p>
@@ -4341,9 +3668,17 @@
           <w:highlight w:val="lightGray"/>
           <w:lang w:eastAsia="pt-BR"/>
         </w:rPr>
-        <w:t>Curva ROC (</w:t>
-      </w:r>
-      <w:proofErr w:type="spellStart"/>
+        <w:t>Curva ROC (Receiver Operating Characteristic)</w:t>
+      </w:r>
+      <w:r>
+        <w:rPr>
+          <w:rFonts w:eastAsia="Times New Roman" w:cs="Times New Roman"/>
+          <w:szCs w:val="24"/>
+          <w:highlight w:val="lightGray"/>
+          <w:lang w:eastAsia="pt-BR"/>
+        </w:rPr>
+        <w:t xml:space="preserve"> é uma ferramenta gráfica amplamente utilizada para avaliar o desempenho de modelos de classificação binária. Essa curva mostra a relação entre a </w:t>
+      </w:r>
       <w:r>
         <w:rPr>
           <w:rFonts w:eastAsia="Times New Roman" w:cs="Times New Roman"/>
@@ -4353,111 +3688,7 @@
           <w:highlight w:val="lightGray"/>
           <w:lang w:eastAsia="pt-BR"/>
         </w:rPr>
-        <w:t>Receiver</w:t>
-      </w:r>
-      <w:proofErr w:type="spellEnd"/>
-      <w:r>
-        <w:rPr>
-          <w:rFonts w:eastAsia="Times New Roman" w:cs="Times New Roman"/>
-          <w:b/>
-          <w:bCs/>
-          <w:szCs w:val="24"/>
-          <w:highlight w:val="lightGray"/>
-          <w:lang w:eastAsia="pt-BR"/>
-        </w:rPr>
-        <w:t xml:space="preserve"> </w:t>
-      </w:r>
-      <w:proofErr w:type="spellStart"/>
-      <w:r>
-        <w:rPr>
-          <w:rFonts w:eastAsia="Times New Roman" w:cs="Times New Roman"/>
-          <w:b/>
-          <w:bCs/>
-          <w:szCs w:val="24"/>
-          <w:highlight w:val="lightGray"/>
-          <w:lang w:eastAsia="pt-BR"/>
-        </w:rPr>
-        <w:t>Operating</w:t>
-      </w:r>
-      <w:proofErr w:type="spellEnd"/>
-      <w:r>
-        <w:rPr>
-          <w:rFonts w:eastAsia="Times New Roman" w:cs="Times New Roman"/>
-          <w:b/>
-          <w:bCs/>
-          <w:szCs w:val="24"/>
-          <w:highlight w:val="lightGray"/>
-          <w:lang w:eastAsia="pt-BR"/>
-        </w:rPr>
-        <w:t xml:space="preserve"> </w:t>
-      </w:r>
-      <w:proofErr w:type="spellStart"/>
-      <w:r>
-        <w:rPr>
-          <w:rFonts w:eastAsia="Times New Roman" w:cs="Times New Roman"/>
-          <w:b/>
-          <w:bCs/>
-          <w:szCs w:val="24"/>
-          <w:highlight w:val="lightGray"/>
-          <w:lang w:eastAsia="pt-BR"/>
-        </w:rPr>
-        <w:t>Characteristic</w:t>
-      </w:r>
-      <w:proofErr w:type="spellEnd"/>
-      <w:r>
-        <w:rPr>
-          <w:rFonts w:eastAsia="Times New Roman" w:cs="Times New Roman"/>
-          <w:b/>
-          <w:bCs/>
-          <w:szCs w:val="24"/>
-          <w:highlight w:val="lightGray"/>
-          <w:lang w:eastAsia="pt-BR"/>
-        </w:rPr>
-        <w:t>)</w:t>
-      </w:r>
-      <w:r>
-        <w:rPr>
-          <w:rFonts w:eastAsia="Times New Roman" w:cs="Times New Roman"/>
-          <w:szCs w:val="24"/>
-          <w:highlight w:val="lightGray"/>
-          <w:lang w:eastAsia="pt-BR"/>
-        </w:rPr>
-        <w:t xml:space="preserve"> é uma ferramenta gráfica amplamente utilizada para avaliar o desempenho de modelos de classificação binária. Essa curva mostra a relação entre a </w:t>
-      </w:r>
-      <w:r>
-        <w:rPr>
-          <w:rFonts w:eastAsia="Times New Roman" w:cs="Times New Roman"/>
-          <w:b/>
-          <w:bCs/>
-          <w:szCs w:val="24"/>
-          <w:highlight w:val="lightGray"/>
-          <w:lang w:eastAsia="pt-BR"/>
-        </w:rPr>
-        <w:t>taxa de verdadeiros positivos (</w:t>
-      </w:r>
-      <w:proofErr w:type="spellStart"/>
-      <w:r>
-        <w:rPr>
-          <w:rFonts w:eastAsia="Times New Roman" w:cs="Times New Roman"/>
-          <w:b/>
-          <w:bCs/>
-          <w:szCs w:val="24"/>
-          <w:highlight w:val="lightGray"/>
-          <w:lang w:eastAsia="pt-BR"/>
-        </w:rPr>
-        <w:t>True</w:t>
-      </w:r>
-      <w:proofErr w:type="spellEnd"/>
-      <w:r>
-        <w:rPr>
-          <w:rFonts w:eastAsia="Times New Roman" w:cs="Times New Roman"/>
-          <w:b/>
-          <w:bCs/>
-          <w:szCs w:val="24"/>
-          <w:highlight w:val="lightGray"/>
-          <w:lang w:eastAsia="pt-BR"/>
-        </w:rPr>
-        <w:t xml:space="preserve"> Positive Rate – TPR)</w:t>
+        <w:t>taxa de verdadeiros positivos (True Positive Rate – TPR)</w:t>
       </w:r>
       <w:r>
         <w:rPr>
@@ -4903,55 +4134,7 @@
           <w:highlight w:val="lightGray"/>
           <w:lang w:eastAsia="pt-BR"/>
         </w:rPr>
-        <w:t xml:space="preserve">AUC (Area </w:t>
-      </w:r>
-      <w:proofErr w:type="spellStart"/>
-      <w:r>
-        <w:rPr>
-          <w:rFonts w:eastAsia="Times New Roman" w:cs="Times New Roman"/>
-          <w:b/>
-          <w:bCs/>
-          <w:szCs w:val="24"/>
-          <w:highlight w:val="lightGray"/>
-          <w:lang w:eastAsia="pt-BR"/>
-        </w:rPr>
-        <w:t>Under</w:t>
-      </w:r>
-      <w:proofErr w:type="spellEnd"/>
-      <w:r>
-        <w:rPr>
-          <w:rFonts w:eastAsia="Times New Roman" w:cs="Times New Roman"/>
-          <w:b/>
-          <w:bCs/>
-          <w:szCs w:val="24"/>
-          <w:highlight w:val="lightGray"/>
-          <w:lang w:eastAsia="pt-BR"/>
-        </w:rPr>
-        <w:t xml:space="preserve"> </w:t>
-      </w:r>
-      <w:proofErr w:type="spellStart"/>
-      <w:r>
-        <w:rPr>
-          <w:rFonts w:eastAsia="Times New Roman" w:cs="Times New Roman"/>
-          <w:b/>
-          <w:bCs/>
-          <w:szCs w:val="24"/>
-          <w:highlight w:val="lightGray"/>
-          <w:lang w:eastAsia="pt-BR"/>
-        </w:rPr>
-        <w:t>the</w:t>
-      </w:r>
-      <w:proofErr w:type="spellEnd"/>
-      <w:r>
-        <w:rPr>
-          <w:rFonts w:eastAsia="Times New Roman" w:cs="Times New Roman"/>
-          <w:b/>
-          <w:bCs/>
-          <w:szCs w:val="24"/>
-          <w:highlight w:val="lightGray"/>
-          <w:lang w:eastAsia="pt-BR"/>
-        </w:rPr>
-        <w:t xml:space="preserve"> Curve)</w:t>
+        <w:t>AUC (Area Under the Curve)</w:t>
       </w:r>
       <w:r>
         <w:rPr>
@@ -5130,9 +4313,17 @@
           <w:highlight w:val="lightGray"/>
           <w:lang w:eastAsia="pt-BR"/>
         </w:rPr>
-        <w:t xml:space="preserve">capacidade discriminativa geral dos modelos </w:t>
-      </w:r>
-      <w:proofErr w:type="spellStart"/>
+        <w:t>capacidade discriminativa geral dos modelos Random Forest e CART</w:t>
+      </w:r>
+      <w:r>
+        <w:rPr>
+          <w:rFonts w:eastAsia="Times New Roman" w:cs="Times New Roman"/>
+          <w:szCs w:val="24"/>
+          <w:highlight w:val="lightGray"/>
+          <w:lang w:eastAsia="pt-BR"/>
+        </w:rPr>
+        <w:t xml:space="preserve">, independentemente da escolha de um limiar específico. Essa abordagem é especialmente útil diante do </w:t>
+      </w:r>
       <w:r>
         <w:rPr>
           <w:rFonts w:eastAsia="Times New Roman" w:cs="Times New Roman"/>
@@ -5142,38 +4333,6 @@
           <w:highlight w:val="lightGray"/>
           <w:lang w:eastAsia="pt-BR"/>
         </w:rPr>
-        <w:t>Random</w:t>
-      </w:r>
-      <w:proofErr w:type="spellEnd"/>
-      <w:r>
-        <w:rPr>
-          <w:rFonts w:eastAsia="Times New Roman" w:cs="Times New Roman"/>
-          <w:b/>
-          <w:bCs/>
-          <w:szCs w:val="24"/>
-          <w:highlight w:val="lightGray"/>
-          <w:lang w:eastAsia="pt-BR"/>
-        </w:rPr>
-        <w:t xml:space="preserve"> Forest e CART</w:t>
-      </w:r>
-      <w:r>
-        <w:rPr>
-          <w:rFonts w:eastAsia="Times New Roman" w:cs="Times New Roman"/>
-          <w:szCs w:val="24"/>
-          <w:highlight w:val="lightGray"/>
-          <w:lang w:eastAsia="pt-BR"/>
-        </w:rPr>
-        <w:t xml:space="preserve">, independentemente da escolha de um limiar específico. Essa abordagem é especialmente útil diante do </w:t>
-      </w:r>
-      <w:r>
-        <w:rPr>
-          <w:rFonts w:eastAsia="Times New Roman" w:cs="Times New Roman"/>
-          <w:b/>
-          <w:bCs/>
-          <w:szCs w:val="24"/>
-          <w:highlight w:val="lightGray"/>
-          <w:lang w:eastAsia="pt-BR"/>
-        </w:rPr>
         <w:t>desbalanceamento da variável alvo EVOLUCAO</w:t>
       </w:r>
       <w:r>
@@ -5200,7 +4359,6 @@
           <w:highlight w:val="lightGray"/>
         </w:rPr>
       </w:pPr>
-      <w:proofErr w:type="spellStart"/>
       <w:r>
         <w:rPr>
           <w:rStyle w:val="Forte"/>
@@ -5208,29 +4366,8 @@
           <w:bCs w:val="0"/>
           <w:highlight w:val="lightGray"/>
         </w:rPr>
-        <w:t>Justificativa</w:t>
-      </w:r>
-      <w:proofErr w:type="spellEnd"/>
-      <w:r>
-        <w:rPr>
-          <w:rStyle w:val="Forte"/>
-          <w:b/>
-          <w:bCs w:val="0"/>
-          <w:highlight w:val="lightGray"/>
-        </w:rPr>
-        <w:t xml:space="preserve"> das Métricas </w:t>
-      </w:r>
-      <w:proofErr w:type="spellStart"/>
-      <w:r>
-        <w:rPr>
-          <w:rStyle w:val="Forte"/>
-          <w:b/>
-          <w:bCs w:val="0"/>
-          <w:highlight w:val="lightGray"/>
-        </w:rPr>
-        <w:t>Utilizadas</w:t>
-      </w:r>
-      <w:proofErr w:type="spellEnd"/>
+        <w:t>Justificativa das Métricas Utilizadas</w:t>
+      </w:r>
     </w:p>
     <w:p>
       <w:pPr>
@@ -5283,21 +4420,7 @@
         <w:rPr>
           <w:highlight w:val="lightGray"/>
         </w:rPr>
-        <w:t xml:space="preserve"> foi adotado como principal métrica comparativa entre os modelos </w:t>
-      </w:r>
-      <w:proofErr w:type="spellStart"/>
-      <w:r>
-        <w:rPr>
-          <w:highlight w:val="lightGray"/>
-        </w:rPr>
-        <w:t>Random</w:t>
-      </w:r>
-      <w:proofErr w:type="spellEnd"/>
-      <w:r>
-        <w:rPr>
-          <w:highlight w:val="lightGray"/>
-        </w:rPr>
-        <w:t xml:space="preserve"> Forest e CART, por equilibrar precisão e recall, oferecendo uma visão mais realista do desempenho preditivo. Além disso, a </w:t>
+        <w:t xml:space="preserve"> foi adotado como principal métrica comparativa entre os modelos Random Forest e CART, por equilibrar precisão e recall, oferecendo uma visão mais realista do desempenho preditivo. Além disso, a </w:t>
       </w:r>
       <w:r>
         <w:rPr>
@@ -5393,63 +4516,7 @@
         <w:rPr>
           <w:highlight w:val="lightGray"/>
         </w:rPr>
-        <w:t xml:space="preserve">Rodrigues et al. (2024) propuseram um estudo com foco na predição de abandono do tratamento da tuberculose utilizando algoritmos de aprendizado de máquina aplicados a dados de registros nacionais do Brasil. O trabalho utilizou um conjunto abrangente de variáveis demográficas, clínicas e sociais disponíveis no Sistema de Informação de Agravos de Notificação (SINAN) para treinar e avaliar modelos supervisionados. Foram testados diferentes algoritmos, incluindo </w:t>
-      </w:r>
-      <w:proofErr w:type="spellStart"/>
-      <w:r>
-        <w:rPr>
-          <w:highlight w:val="lightGray"/>
-        </w:rPr>
-        <w:t>Random</w:t>
-      </w:r>
-      <w:proofErr w:type="spellEnd"/>
-      <w:r>
-        <w:rPr>
-          <w:highlight w:val="lightGray"/>
-        </w:rPr>
-        <w:t xml:space="preserve"> Forest, </w:t>
-      </w:r>
-      <w:proofErr w:type="spellStart"/>
-      <w:r>
-        <w:rPr>
-          <w:highlight w:val="lightGray"/>
-        </w:rPr>
-        <w:t>XGBoost</w:t>
-      </w:r>
-      <w:proofErr w:type="spellEnd"/>
-      <w:r>
-        <w:rPr>
-          <w:highlight w:val="lightGray"/>
-        </w:rPr>
-        <w:t xml:space="preserve">, </w:t>
-      </w:r>
-      <w:proofErr w:type="spellStart"/>
-      <w:r>
-        <w:rPr>
-          <w:highlight w:val="lightGray"/>
-        </w:rPr>
-        <w:t>LightGBM</w:t>
-      </w:r>
-      <w:proofErr w:type="spellEnd"/>
-      <w:r>
-        <w:rPr>
-          <w:highlight w:val="lightGray"/>
-        </w:rPr>
-        <w:t xml:space="preserve">, entre outros, com o objetivo de identificar pacientes com maior probabilidade de evasão do tratamento. Os modelos apresentaram desempenho promissor, com destaque para o </w:t>
-      </w:r>
-      <w:proofErr w:type="spellStart"/>
-      <w:r>
-        <w:rPr>
-          <w:highlight w:val="lightGray"/>
-        </w:rPr>
-        <w:t>XGBoost</w:t>
-      </w:r>
-      <w:proofErr w:type="spellEnd"/>
-      <w:r>
-        <w:rPr>
-          <w:highlight w:val="lightGray"/>
-        </w:rPr>
-        <w:t>, que alcançou AUC-ROC superior a 0,75. Os autores destacam a importância do uso de inteligência artificial como ferramenta auxiliar na vigilância em saúde pública, sugerindo que modelos preditivos podem orientar estratégias direcionadas de intervenção, reduzindo perdas no tratamento e melhorando o controle da doença.</w:t>
+        <w:t>Rodrigues et al. (2024) propuseram um estudo com foco na predição de abandono do tratamento da tuberculose utilizando algoritmos de aprendizado de máquina aplicados a dados de registros nacionais do Brasil. O trabalho utilizou um conjunto abrangente de variáveis demográficas, clínicas e sociais disponíveis no Sistema de Informação de Agravos de Notificação (SINAN) para treinar e avaliar modelos supervisionados. Foram testados diferentes algoritmos, incluindo Random Forest, XGBoost, LightGBM, entre outros, com o objetivo de identificar pacientes com maior probabilidade de evasão do tratamento. Os modelos apresentaram desempenho promissor, com destaque para o XGBoost, que alcançou AUC-ROC superior a 0,75. Os autores destacam a importância do uso de inteligência artificial como ferramenta auxiliar na vigilância em saúde pública, sugerindo que modelos preditivos podem orientar estratégias direcionadas de intervenção, reduzindo perdas no tratamento e melhorando o controle da doença.</w:t>
       </w:r>
       <w:r>
         <w:t xml:space="preserve"> </w:t>
@@ -5490,90 +4557,32 @@
       <w:pPr>
         <w:spacing w:line="240" w:lineRule="auto"/>
       </w:pPr>
-      <w:proofErr w:type="spellStart"/>
-      <w:r>
-        <w:rPr>
-          <w:highlight w:val="lightGray"/>
-        </w:rPr>
-        <w:t>Savalli</w:t>
-      </w:r>
-      <w:proofErr w:type="spellEnd"/>
-      <w:r>
-        <w:rPr>
-          <w:highlight w:val="lightGray"/>
-        </w:rPr>
-        <w:t xml:space="preserve"> et al. (2025) conduziram um estudo multicêntrico utilizando algoritmos de aprendizado de máquina para prever a admissão de pacientes com COVID-19 em Unidades de Terapia Intensiva (UTI) com base em dados clínicos e laboratoriais coletados em 12 hospitais brasileiros. O modelo </w:t>
-      </w:r>
-      <w:proofErr w:type="spellStart"/>
-      <w:r>
-        <w:rPr>
-          <w:highlight w:val="lightGray"/>
-        </w:rPr>
-        <w:t>XGBoost</w:t>
-      </w:r>
-      <w:proofErr w:type="spellEnd"/>
-      <w:r>
-        <w:rPr>
-          <w:highlight w:val="lightGray"/>
-        </w:rPr>
-        <w:t xml:space="preserve"> foi treinado individualmente em cada hospital para avaliar a performance local e identificar a instituição com melhor desempenho preditivo. Esse modelo foi então validado externamente nos demais hospitais e posteriormente ajustado com técnicas de </w:t>
-      </w:r>
-      <w:proofErr w:type="spellStart"/>
+      <w:r>
+        <w:rPr>
+          <w:highlight w:val="lightGray"/>
+        </w:rPr>
+        <w:t xml:space="preserve">Savalli et al. (2025) conduziram um estudo multicêntrico utilizando algoritmos de aprendizado de máquina para prever a admissão de pacientes com COVID-19 em Unidades de Terapia Intensiva (UTI) com base em dados clínicos e laboratoriais coletados em 12 hospitais brasileiros. O modelo XGBoost foi treinado individualmente em cada hospital para avaliar a performance local e identificar a instituição com melhor desempenho preditivo. Esse modelo foi então validado externamente nos demais hospitais e posteriormente ajustado com técnicas de </w:t>
+      </w:r>
       <w:r>
         <w:rPr>
           <w:rStyle w:val="nfase"/>
           <w:highlight w:val="lightGray"/>
         </w:rPr>
-        <w:t>transfer</w:t>
-      </w:r>
-      <w:proofErr w:type="spellEnd"/>
+        <w:t>transfer learning</w:t>
+      </w:r>
+      <w:r>
+        <w:rPr>
+          <w:highlight w:val="lightGray"/>
+        </w:rPr>
+        <w:t xml:space="preserve">. Os resultados indicaram variações significativas na performance entre os hospitais (AUC entre 0.62 e 0.94), sendo que a aplicação do </w:t>
+      </w:r>
       <w:r>
         <w:rPr>
           <w:rStyle w:val="nfase"/>
           <w:highlight w:val="lightGray"/>
         </w:rPr>
-        <w:t xml:space="preserve"> </w:t>
-      </w:r>
-      <w:proofErr w:type="spellStart"/>
-      <w:r>
-        <w:rPr>
-          <w:rStyle w:val="nfase"/>
-          <w:highlight w:val="lightGray"/>
-        </w:rPr>
-        <w:t>learning</w:t>
-      </w:r>
-      <w:proofErr w:type="spellEnd"/>
-      <w:r>
-        <w:rPr>
-          <w:highlight w:val="lightGray"/>
-        </w:rPr>
-        <w:t xml:space="preserve">. Os resultados indicaram variações significativas na performance entre os hospitais (AUC entre 0.62 e 0.94), sendo que a aplicação do </w:t>
-      </w:r>
-      <w:proofErr w:type="spellStart"/>
-      <w:r>
-        <w:rPr>
-          <w:rStyle w:val="nfase"/>
-          <w:highlight w:val="lightGray"/>
-        </w:rPr>
-        <w:t>transfer</w:t>
-      </w:r>
-      <w:proofErr w:type="spellEnd"/>
-      <w:r>
-        <w:rPr>
-          <w:rStyle w:val="nfase"/>
-          <w:highlight w:val="lightGray"/>
-        </w:rPr>
-        <w:t xml:space="preserve"> </w:t>
-      </w:r>
-      <w:proofErr w:type="spellStart"/>
-      <w:r>
-        <w:rPr>
-          <w:rStyle w:val="nfase"/>
-          <w:highlight w:val="lightGray"/>
-        </w:rPr>
-        <w:t>learning</w:t>
-      </w:r>
-      <w:proofErr w:type="spellEnd"/>
+        <w:t>transfer learning</w:t>
+      </w:r>
       <w:r>
         <w:rPr>
           <w:highlight w:val="lightGray"/>
@@ -5674,37 +4683,12 @@
         </w:rPr>
         <w:t>O estudo foi conduzido com base no processo de Descoberta de Conhecimento em Bases de Dados (</w:t>
       </w:r>
-      <w:proofErr w:type="spellStart"/>
       <w:r>
         <w:rPr>
           <w:rStyle w:val="nfase"/>
           <w:highlight w:val="lightGray"/>
         </w:rPr>
-        <w:t>Knowledge</w:t>
-      </w:r>
-      <w:proofErr w:type="spellEnd"/>
-      <w:r>
-        <w:rPr>
-          <w:rStyle w:val="nfase"/>
-          <w:highlight w:val="lightGray"/>
-        </w:rPr>
-        <w:t xml:space="preserve"> Discovery in </w:t>
-      </w:r>
-      <w:proofErr w:type="spellStart"/>
-      <w:r>
-        <w:rPr>
-          <w:rStyle w:val="nfase"/>
-          <w:highlight w:val="lightGray"/>
-        </w:rPr>
-        <w:t>Databases</w:t>
-      </w:r>
-      <w:proofErr w:type="spellEnd"/>
-      <w:r>
-        <w:rPr>
-          <w:rStyle w:val="nfase"/>
-          <w:highlight w:val="lightGray"/>
-        </w:rPr>
-        <w:t xml:space="preserve"> – KDD</w:t>
+        <w:t>Knowledge Discovery in Databases – KDD</w:t>
       </w:r>
       <w:r>
         <w:rPr>
@@ -5814,21 +4798,7 @@
         <w:rPr>
           <w:highlight w:val="lightGray"/>
         </w:rPr>
-        <w:t xml:space="preserve">: aplicação dos algoritmos </w:t>
-      </w:r>
-      <w:proofErr w:type="spellStart"/>
-      <w:r>
-        <w:rPr>
-          <w:highlight w:val="lightGray"/>
-        </w:rPr>
-        <w:t>Random</w:t>
-      </w:r>
-      <w:proofErr w:type="spellEnd"/>
-      <w:r>
-        <w:rPr>
-          <w:highlight w:val="lightGray"/>
-        </w:rPr>
-        <w:t xml:space="preserve"> Forest e CART para predição do desfecho clínico (</w:t>
+        <w:t>: aplicação dos algoritmos Random Forest e CART para predição do desfecho clínico (</w:t>
       </w:r>
       <w:r>
         <w:rPr>
@@ -5869,7 +4839,6 @@
         </w:rPr>
         <w:t xml:space="preserve">: análise do desempenho dos modelos e da execução do algoritmo </w:t>
       </w:r>
-      <w:proofErr w:type="spellStart"/>
       <w:r>
         <w:rPr>
           <w:rStyle w:val="CdigoHTML"/>
@@ -5878,7 +4847,6 @@
         </w:rPr>
         <w:t>real_collab</w:t>
       </w:r>
-      <w:proofErr w:type="spellEnd"/>
       <w:r>
         <w:rPr>
           <w:highlight w:val="lightGray"/>
@@ -5929,7 +4897,6 @@
         </w:rPr>
         <w:t xml:space="preserve">, disponibilizado pelo </w:t>
       </w:r>
-      <w:proofErr w:type="spellStart"/>
       <w:r>
         <w:rPr>
           <w:rStyle w:val="Forte"/>
@@ -5937,26 +4904,11 @@
         </w:rPr>
         <w:t>DataSUS</w:t>
       </w:r>
-      <w:proofErr w:type="spellEnd"/>
-      <w:r>
-        <w:rPr>
-          <w:highlight w:val="lightGray"/>
-        </w:rPr>
-        <w:t xml:space="preserve">, que contém informações epidemiológicas de pacientes hospitalizados com SRAG no Brasil. O </w:t>
-      </w:r>
-      <w:proofErr w:type="spellStart"/>
-      <w:r>
-        <w:rPr>
-          <w:highlight w:val="lightGray"/>
-        </w:rPr>
-        <w:t>dataset</w:t>
-      </w:r>
-      <w:proofErr w:type="spellEnd"/>
-      <w:r>
-        <w:rPr>
-          <w:highlight w:val="lightGray"/>
-        </w:rPr>
-        <w:t xml:space="preserve"> abrange variáveis clínicas, demográficas, de comorbidades, uso de suporte ventilatório, vacinação e desfecho clínico.</w:t>
+      <w:r>
+        <w:rPr>
+          <w:highlight w:val="lightGray"/>
+        </w:rPr>
+        <w:t>, que contém informações epidemiológicas de pacientes hospitalizados com SRAG no Brasil. O dataset abrange variáveis clínicas, demográficas, de comorbidades, uso de suporte ventilatório, vacinação e desfecho clínico.</w:t>
       </w:r>
     </w:p>
     <w:p>
@@ -6016,7 +4968,6 @@
         </w:rPr>
       </w:pPr>
       <w:bookmarkStart w:id="11" w:name="_Toc203566820"/>
-      <w:proofErr w:type="spellStart"/>
       <w:r>
         <w:rPr>
           <w:bCs/>
@@ -6025,7 +4976,6 @@
         <w:t>Pré-processamento</w:t>
       </w:r>
       <w:bookmarkEnd w:id="11"/>
-      <w:proofErr w:type="spellEnd"/>
     </w:p>
     <w:p>
       <w:pPr>
@@ -6222,7 +5172,6 @@
         </w:rPr>
         <w:t xml:space="preserve">, visando mitigar o desbalanceamento entre casos de cura e óbito, utilizando técnicas como </w:t>
       </w:r>
-      <w:proofErr w:type="spellStart"/>
       <w:r>
         <w:rPr>
           <w:rFonts w:eastAsia="Times New Roman" w:cs="Times New Roman"/>
@@ -6232,33 +5181,8 @@
           <w:highlight w:val="lightGray"/>
           <w:lang w:eastAsia="pt-BR"/>
         </w:rPr>
-        <w:t>Random</w:t>
-      </w:r>
-      <w:proofErr w:type="spellEnd"/>
-      <w:r>
-        <w:rPr>
-          <w:rFonts w:eastAsia="Times New Roman" w:cs="Times New Roman"/>
-          <w:i/>
-          <w:iCs/>
-          <w:szCs w:val="24"/>
-          <w:highlight w:val="lightGray"/>
-          <w:lang w:eastAsia="pt-BR"/>
-        </w:rPr>
-        <w:t xml:space="preserve"> </w:t>
-      </w:r>
-      <w:proofErr w:type="spellStart"/>
-      <w:r>
-        <w:rPr>
-          <w:rFonts w:eastAsia="Times New Roman" w:cs="Times New Roman"/>
-          <w:i/>
-          <w:iCs/>
-          <w:szCs w:val="24"/>
-          <w:highlight w:val="lightGray"/>
-          <w:lang w:eastAsia="pt-BR"/>
-        </w:rPr>
-        <w:t>Oversampling</w:t>
-      </w:r>
-      <w:proofErr w:type="spellEnd"/>
+        <w:t>Random Oversampling</w:t>
+      </w:r>
       <w:r>
         <w:rPr>
           <w:rFonts w:eastAsia="Times New Roman" w:cs="Times New Roman"/>
@@ -6372,69 +5296,8 @@
           <w:highlight w:val="lightGray"/>
           <w:lang w:eastAsia="pt-BR"/>
         </w:rPr>
-        <w:t xml:space="preserve">Bibliotecas </w:t>
-      </w:r>
-      <w:proofErr w:type="spellStart"/>
-      <w:r>
-        <w:rPr>
-          <w:rFonts w:eastAsia="Times New Roman" w:cs="Times New Roman"/>
-          <w:b/>
-          <w:bCs/>
-          <w:szCs w:val="24"/>
-          <w:highlight w:val="lightGray"/>
-          <w:lang w:eastAsia="pt-BR"/>
-        </w:rPr>
-        <w:t>Scikit-learn</w:t>
-      </w:r>
-      <w:proofErr w:type="spellEnd"/>
-      <w:r>
-        <w:rPr>
-          <w:rFonts w:eastAsia="Times New Roman" w:cs="Times New Roman"/>
-          <w:b/>
-          <w:bCs/>
-          <w:szCs w:val="24"/>
-          <w:highlight w:val="lightGray"/>
-          <w:lang w:eastAsia="pt-BR"/>
-        </w:rPr>
-        <w:t xml:space="preserve">, Pandas, </w:t>
-      </w:r>
-      <w:proofErr w:type="spellStart"/>
-      <w:r>
-        <w:rPr>
-          <w:rFonts w:eastAsia="Times New Roman" w:cs="Times New Roman"/>
-          <w:b/>
-          <w:bCs/>
-          <w:szCs w:val="24"/>
-          <w:highlight w:val="lightGray"/>
-          <w:lang w:eastAsia="pt-BR"/>
-        </w:rPr>
-        <w:t>Matplotlib</w:t>
-      </w:r>
-      <w:proofErr w:type="spellEnd"/>
-      <w:r>
-        <w:rPr>
-          <w:rFonts w:eastAsia="Times New Roman" w:cs="Times New Roman"/>
-          <w:b/>
-          <w:bCs/>
-          <w:szCs w:val="24"/>
-          <w:highlight w:val="lightGray"/>
-          <w:lang w:eastAsia="pt-BR"/>
-        </w:rPr>
-        <w:t xml:space="preserve"> e </w:t>
-      </w:r>
-      <w:proofErr w:type="spellStart"/>
-      <w:r>
-        <w:rPr>
-          <w:rFonts w:eastAsia="Times New Roman" w:cs="Times New Roman"/>
-          <w:b/>
-          <w:bCs/>
-          <w:szCs w:val="24"/>
-          <w:highlight w:val="lightGray"/>
-          <w:lang w:eastAsia="pt-BR"/>
-        </w:rPr>
-        <w:t>Seaborn</w:t>
-      </w:r>
-      <w:proofErr w:type="spellEnd"/>
+        <w:t>Bibliotecas Scikit-learn, Pandas, Matplotlib e Seaborn</w:t>
+      </w:r>
       <w:r>
         <w:rPr>
           <w:rFonts w:eastAsia="Times New Roman" w:cs="Times New Roman"/>
@@ -6468,55 +5331,7 @@
           <w:highlight w:val="lightGray"/>
           <w:lang w:eastAsia="pt-BR"/>
         </w:rPr>
-        <w:t xml:space="preserve">Google </w:t>
-      </w:r>
-      <w:proofErr w:type="spellStart"/>
-      <w:r>
-        <w:rPr>
-          <w:rFonts w:eastAsia="Times New Roman" w:cs="Times New Roman"/>
-          <w:b/>
-          <w:bCs/>
-          <w:szCs w:val="24"/>
-          <w:highlight w:val="lightGray"/>
-          <w:lang w:eastAsia="pt-BR"/>
-        </w:rPr>
-        <w:t>Colab</w:t>
-      </w:r>
-      <w:proofErr w:type="spellEnd"/>
-      <w:r>
-        <w:rPr>
-          <w:rFonts w:eastAsia="Times New Roman" w:cs="Times New Roman"/>
-          <w:b/>
-          <w:bCs/>
-          <w:szCs w:val="24"/>
-          <w:highlight w:val="lightGray"/>
-          <w:lang w:eastAsia="pt-BR"/>
-        </w:rPr>
-        <w:t xml:space="preserve"> e </w:t>
-      </w:r>
-      <w:proofErr w:type="spellStart"/>
-      <w:r>
-        <w:rPr>
-          <w:rFonts w:eastAsia="Times New Roman" w:cs="Times New Roman"/>
-          <w:b/>
-          <w:bCs/>
-          <w:szCs w:val="24"/>
-          <w:highlight w:val="lightGray"/>
-          <w:lang w:eastAsia="pt-BR"/>
-        </w:rPr>
-        <w:t>Jupyter</w:t>
-      </w:r>
-      <w:proofErr w:type="spellEnd"/>
-      <w:r>
-        <w:rPr>
-          <w:rFonts w:eastAsia="Times New Roman" w:cs="Times New Roman"/>
-          <w:b/>
-          <w:bCs/>
-          <w:szCs w:val="24"/>
-          <w:highlight w:val="lightGray"/>
-          <w:lang w:eastAsia="pt-BR"/>
-        </w:rPr>
-        <w:t xml:space="preserve"> Notebook</w:t>
+        <w:t>Google Colab e Jupyter Notebook</w:t>
       </w:r>
       <w:r>
         <w:rPr>
@@ -6553,7 +5368,6 @@
         </w:rPr>
         <w:t xml:space="preserve">Notebook </w:t>
       </w:r>
-      <w:proofErr w:type="spellStart"/>
       <w:r>
         <w:rPr>
           <w:rFonts w:ascii="Courier New" w:eastAsia="Times New Roman" w:hAnsi="Courier New" w:cs="Courier New"/>
@@ -6566,7 +5380,6 @@
         </w:rPr>
         <w:t>real_collab</w:t>
       </w:r>
-      <w:proofErr w:type="spellEnd"/>
       <w:r>
         <w:rPr>
           <w:rFonts w:eastAsia="Times New Roman" w:cs="Times New Roman"/>
@@ -6645,103 +5458,7 @@
           <w:highlight w:val="lightGray"/>
           <w:lang w:eastAsia="pt-BR"/>
         </w:rPr>
-        <w:t>CART (</w:t>
-      </w:r>
-      <w:proofErr w:type="spellStart"/>
-      <w:r>
-        <w:rPr>
-          <w:rFonts w:eastAsia="Times New Roman" w:cs="Times New Roman"/>
-          <w:b/>
-          <w:bCs/>
-          <w:szCs w:val="24"/>
-          <w:highlight w:val="lightGray"/>
-          <w:lang w:eastAsia="pt-BR"/>
-        </w:rPr>
-        <w:t>Classification</w:t>
-      </w:r>
-      <w:proofErr w:type="spellEnd"/>
-      <w:r>
-        <w:rPr>
-          <w:rFonts w:eastAsia="Times New Roman" w:cs="Times New Roman"/>
-          <w:b/>
-          <w:bCs/>
-          <w:szCs w:val="24"/>
-          <w:highlight w:val="lightGray"/>
-          <w:lang w:eastAsia="pt-BR"/>
-        </w:rPr>
-        <w:t xml:space="preserve"> </w:t>
-      </w:r>
-      <w:proofErr w:type="spellStart"/>
-      <w:r>
-        <w:rPr>
-          <w:rFonts w:eastAsia="Times New Roman" w:cs="Times New Roman"/>
-          <w:b/>
-          <w:bCs/>
-          <w:szCs w:val="24"/>
-          <w:highlight w:val="lightGray"/>
-          <w:lang w:eastAsia="pt-BR"/>
-        </w:rPr>
-        <w:t>and</w:t>
-      </w:r>
-      <w:proofErr w:type="spellEnd"/>
-      <w:r>
-        <w:rPr>
-          <w:rFonts w:eastAsia="Times New Roman" w:cs="Times New Roman"/>
-          <w:b/>
-          <w:bCs/>
-          <w:szCs w:val="24"/>
-          <w:highlight w:val="lightGray"/>
-          <w:lang w:eastAsia="pt-BR"/>
-        </w:rPr>
-        <w:t xml:space="preserve"> </w:t>
-      </w:r>
-      <w:proofErr w:type="spellStart"/>
-      <w:r>
-        <w:rPr>
-          <w:rFonts w:eastAsia="Times New Roman" w:cs="Times New Roman"/>
-          <w:b/>
-          <w:bCs/>
-          <w:szCs w:val="24"/>
-          <w:highlight w:val="lightGray"/>
-          <w:lang w:eastAsia="pt-BR"/>
-        </w:rPr>
-        <w:t>Regression</w:t>
-      </w:r>
-      <w:proofErr w:type="spellEnd"/>
-      <w:r>
-        <w:rPr>
-          <w:rFonts w:eastAsia="Times New Roman" w:cs="Times New Roman"/>
-          <w:b/>
-          <w:bCs/>
-          <w:szCs w:val="24"/>
-          <w:highlight w:val="lightGray"/>
-          <w:lang w:eastAsia="pt-BR"/>
-        </w:rPr>
-        <w:t xml:space="preserve"> </w:t>
-      </w:r>
-      <w:proofErr w:type="spellStart"/>
-      <w:r>
-        <w:rPr>
-          <w:rFonts w:eastAsia="Times New Roman" w:cs="Times New Roman"/>
-          <w:b/>
-          <w:bCs/>
-          <w:szCs w:val="24"/>
-          <w:highlight w:val="lightGray"/>
-          <w:lang w:eastAsia="pt-BR"/>
-        </w:rPr>
-        <w:t>Trees</w:t>
-      </w:r>
-      <w:proofErr w:type="spellEnd"/>
-      <w:r>
-        <w:rPr>
-          <w:rFonts w:eastAsia="Times New Roman" w:cs="Times New Roman"/>
-          <w:b/>
-          <w:bCs/>
-          <w:szCs w:val="24"/>
-          <w:highlight w:val="lightGray"/>
-          <w:lang w:eastAsia="pt-BR"/>
-        </w:rPr>
-        <w:t>)</w:t>
+        <w:t>CART (Classification and Regression Trees)</w:t>
       </w:r>
       <w:r>
         <w:rPr>
@@ -6767,7 +5484,6 @@
           <w:lang w:eastAsia="pt-BR"/>
         </w:rPr>
       </w:pPr>
-      <w:proofErr w:type="spellStart"/>
       <w:r>
         <w:rPr>
           <w:rFonts w:eastAsia="Times New Roman" w:cs="Times New Roman"/>
@@ -6777,19 +5493,7 @@
           <w:highlight w:val="lightGray"/>
           <w:lang w:eastAsia="pt-BR"/>
         </w:rPr>
-        <w:t>Random</w:t>
-      </w:r>
-      <w:proofErr w:type="spellEnd"/>
-      <w:r>
-        <w:rPr>
-          <w:rFonts w:eastAsia="Times New Roman" w:cs="Times New Roman"/>
-          <w:b/>
-          <w:bCs/>
-          <w:szCs w:val="24"/>
-          <w:highlight w:val="lightGray"/>
-          <w:lang w:eastAsia="pt-BR"/>
-        </w:rPr>
-        <w:t xml:space="preserve"> Forest</w:t>
+        <w:t>Random Forest</w:t>
       </w:r>
       <w:r>
         <w:rPr>
@@ -6888,27 +5592,7 @@
           <w:highlight w:val="lightGray"/>
           <w:lang w:eastAsia="pt-BR"/>
         </w:rPr>
-        <w:t xml:space="preserve">Os modelos CART e </w:t>
-      </w:r>
-      <w:proofErr w:type="spellStart"/>
-      <w:r>
-        <w:rPr>
-          <w:rFonts w:eastAsia="Times New Roman" w:cs="Times New Roman"/>
-          <w:szCs w:val="24"/>
-          <w:highlight w:val="lightGray"/>
-          <w:lang w:eastAsia="pt-BR"/>
-        </w:rPr>
-        <w:t>Random</w:t>
-      </w:r>
-      <w:proofErr w:type="spellEnd"/>
-      <w:r>
-        <w:rPr>
-          <w:rFonts w:eastAsia="Times New Roman" w:cs="Times New Roman"/>
-          <w:szCs w:val="24"/>
-          <w:highlight w:val="lightGray"/>
-          <w:lang w:eastAsia="pt-BR"/>
-        </w:rPr>
-        <w:t xml:space="preserve"> Forest foram avaliados com base nas seguintes métricas:</w:t>
+        <w:t>Os modelos CART e Random Forest foram avaliados com base nas seguintes métricas:</w:t>
       </w:r>
     </w:p>
     <w:p>
@@ -6969,31 +5653,7 @@
           <w:highlight w:val="lightGray"/>
           <w:lang w:eastAsia="pt-BR"/>
         </w:rPr>
-        <w:t xml:space="preserve">Precisão e </w:t>
-      </w:r>
-      <w:proofErr w:type="spellStart"/>
-      <w:r>
-        <w:rPr>
-          <w:rFonts w:eastAsia="Times New Roman" w:cs="Times New Roman"/>
-          <w:b/>
-          <w:bCs/>
-          <w:szCs w:val="24"/>
-          <w:highlight w:val="lightGray"/>
-          <w:lang w:eastAsia="pt-BR"/>
-        </w:rPr>
-        <w:t>Revocação</w:t>
-      </w:r>
-      <w:proofErr w:type="spellEnd"/>
-      <w:r>
-        <w:rPr>
-          <w:rFonts w:eastAsia="Times New Roman" w:cs="Times New Roman"/>
-          <w:b/>
-          <w:bCs/>
-          <w:szCs w:val="24"/>
-          <w:highlight w:val="lightGray"/>
-          <w:lang w:eastAsia="pt-BR"/>
-        </w:rPr>
-        <w:t xml:space="preserve"> (Recall)</w:t>
+        <w:t>Precisão e Revocação (Recall)</w:t>
       </w:r>
       <w:r>
         <w:rPr>
@@ -7168,7 +5828,6 @@
         </w:rPr>
         <w:t>Com o objetivo de avaliar o desempenho computacional do notebook desenvolvido (</w:t>
       </w:r>
-      <w:proofErr w:type="spellStart"/>
       <w:r>
         <w:rPr>
           <w:rStyle w:val="CdigoHTML"/>
@@ -7177,7 +5836,6 @@
         </w:rPr>
         <w:t>real_collab</w:t>
       </w:r>
-      <w:proofErr w:type="spellEnd"/>
       <w:r>
         <w:rPr>
           <w:highlight w:val="lightGray"/>
@@ -7445,27 +6103,7 @@
                 <w:highlight w:val="lightGray"/>
                 <w:lang w:eastAsia="pt-BR"/>
               </w:rPr>
-              <w:t xml:space="preserve">AMD </w:t>
-            </w:r>
-            <w:proofErr w:type="spellStart"/>
-            <w:r>
-              <w:rPr>
-                <w:rFonts w:eastAsia="Times New Roman" w:cs="Times New Roman"/>
-                <w:szCs w:val="24"/>
-                <w:highlight w:val="lightGray"/>
-                <w:lang w:eastAsia="pt-BR"/>
-              </w:rPr>
-              <w:t>Ryzen</w:t>
-            </w:r>
-            <w:proofErr w:type="spellEnd"/>
-            <w:r>
-              <w:rPr>
-                <w:rFonts w:eastAsia="Times New Roman" w:cs="Times New Roman"/>
-                <w:szCs w:val="24"/>
-                <w:highlight w:val="lightGray"/>
-                <w:lang w:eastAsia="pt-BR"/>
-              </w:rPr>
-              <w:t xml:space="preserve"> 5 1600X</w:t>
+              <w:t>AMD Ryzen 5 1600X</w:t>
             </w:r>
           </w:p>
         </w:tc>
@@ -7856,7 +6494,6 @@
                 <w:lang w:eastAsia="pt-BR"/>
               </w:rPr>
             </w:pPr>
-            <w:proofErr w:type="spellStart"/>
             <w:r>
               <w:rPr>
                 <w:rFonts w:eastAsia="Times New Roman" w:cs="Times New Roman"/>
@@ -7864,37 +6501,7 @@
                 <w:highlight w:val="lightGray"/>
                 <w:lang w:eastAsia="pt-BR"/>
               </w:rPr>
-              <w:t>openSUSE</w:t>
-            </w:r>
-            <w:proofErr w:type="spellEnd"/>
-            <w:r>
-              <w:rPr>
-                <w:rFonts w:eastAsia="Times New Roman" w:cs="Times New Roman"/>
-                <w:szCs w:val="24"/>
-                <w:highlight w:val="lightGray"/>
-                <w:lang w:eastAsia="pt-BR"/>
-              </w:rPr>
-              <w:t xml:space="preserve"> </w:t>
-            </w:r>
-            <w:proofErr w:type="spellStart"/>
-            <w:r>
-              <w:rPr>
-                <w:rFonts w:eastAsia="Times New Roman" w:cs="Times New Roman"/>
-                <w:szCs w:val="24"/>
-                <w:highlight w:val="lightGray"/>
-                <w:lang w:eastAsia="pt-BR"/>
-              </w:rPr>
-              <w:t>Leap</w:t>
-            </w:r>
-            <w:proofErr w:type="spellEnd"/>
-            <w:r>
-              <w:rPr>
-                <w:rFonts w:eastAsia="Times New Roman" w:cs="Times New Roman"/>
-                <w:szCs w:val="24"/>
-                <w:highlight w:val="lightGray"/>
-                <w:lang w:eastAsia="pt-BR"/>
-              </w:rPr>
-              <w:t xml:space="preserve"> (kernel 5.14)</w:t>
+              <w:t>openSUSE Leap (kernel 5.14)</w:t>
             </w:r>
           </w:p>
         </w:tc>
@@ -7944,7 +6551,6 @@
         </w:rPr>
         <w:t xml:space="preserve">O tempo total de execução do algoritmo </w:t>
       </w:r>
-      <w:proofErr w:type="spellStart"/>
       <w:r>
         <w:rPr>
           <w:rStyle w:val="CdigoHTML"/>
@@ -7953,7 +6559,6 @@
         </w:rPr>
         <w:t>real_collab</w:t>
       </w:r>
-      <w:proofErr w:type="spellEnd"/>
       <w:r>
         <w:rPr>
           <w:highlight w:val="lightGray"/>
@@ -8151,67 +6756,7 @@
           <w:highlight w:val="lightGray"/>
           <w:lang w:eastAsia="pt-BR"/>
         </w:rPr>
-        <w:t>Comparações entre os modelos (</w:t>
-      </w:r>
-      <w:proofErr w:type="spellStart"/>
-      <w:r>
-        <w:rPr>
-          <w:rFonts w:eastAsia="Times New Roman" w:cs="Times New Roman"/>
-          <w:szCs w:val="24"/>
-          <w:highlight w:val="lightGray"/>
-          <w:lang w:eastAsia="pt-BR"/>
-        </w:rPr>
-        <w:t>ex</w:t>
-      </w:r>
-      <w:proofErr w:type="spellEnd"/>
-      <w:r>
-        <w:rPr>
-          <w:rFonts w:eastAsia="Times New Roman" w:cs="Times New Roman"/>
-          <w:szCs w:val="24"/>
-          <w:highlight w:val="lightGray"/>
-          <w:lang w:eastAsia="pt-BR"/>
-        </w:rPr>
-        <w:t xml:space="preserve">: CART </w:t>
-      </w:r>
-      <w:proofErr w:type="spellStart"/>
-      <w:r>
-        <w:rPr>
-          <w:rFonts w:eastAsia="Times New Roman" w:cs="Times New Roman"/>
-          <w:szCs w:val="24"/>
-          <w:highlight w:val="lightGray"/>
-          <w:lang w:eastAsia="pt-BR"/>
-        </w:rPr>
-        <w:t>vs</w:t>
-      </w:r>
-      <w:proofErr w:type="spellEnd"/>
-      <w:r>
-        <w:rPr>
-          <w:rFonts w:eastAsia="Times New Roman" w:cs="Times New Roman"/>
-          <w:szCs w:val="24"/>
-          <w:highlight w:val="lightGray"/>
-          <w:lang w:eastAsia="pt-BR"/>
-        </w:rPr>
-        <w:t xml:space="preserve"> </w:t>
-      </w:r>
-      <w:proofErr w:type="spellStart"/>
-      <w:r>
-        <w:rPr>
-          <w:rFonts w:eastAsia="Times New Roman" w:cs="Times New Roman"/>
-          <w:szCs w:val="24"/>
-          <w:highlight w:val="lightGray"/>
-          <w:lang w:eastAsia="pt-BR"/>
-        </w:rPr>
-        <w:t>Random</w:t>
-      </w:r>
-      <w:proofErr w:type="spellEnd"/>
-      <w:r>
-        <w:rPr>
-          <w:rFonts w:eastAsia="Times New Roman" w:cs="Times New Roman"/>
-          <w:szCs w:val="24"/>
-          <w:highlight w:val="lightGray"/>
-          <w:lang w:eastAsia="pt-BR"/>
-        </w:rPr>
-        <w:t xml:space="preserve"> Forest)</w:t>
+        <w:t>Comparações entre os modelos (ex: CART vs Random Forest)</w:t>
       </w:r>
     </w:p>
     <w:p>
@@ -8236,39 +6781,8 @@
           <w:highlight w:val="lightGray"/>
           <w:lang w:eastAsia="pt-BR"/>
         </w:rPr>
-        <w:t xml:space="preserve">Tabelas de </w:t>
-      </w:r>
-      <w:proofErr w:type="spellStart"/>
-      <w:r>
-        <w:rPr>
-          <w:rFonts w:eastAsia="Times New Roman" w:cs="Times New Roman"/>
-          <w:szCs w:val="24"/>
-          <w:highlight w:val="lightGray"/>
-          <w:lang w:eastAsia="pt-BR"/>
-        </w:rPr>
-        <w:t>feature</w:t>
-      </w:r>
-      <w:proofErr w:type="spellEnd"/>
-      <w:r>
-        <w:rPr>
-          <w:rFonts w:eastAsia="Times New Roman" w:cs="Times New Roman"/>
-          <w:szCs w:val="24"/>
-          <w:highlight w:val="lightGray"/>
-          <w:lang w:eastAsia="pt-BR"/>
-        </w:rPr>
-        <w:t xml:space="preserve"> </w:t>
-      </w:r>
-      <w:proofErr w:type="spellStart"/>
-      <w:r>
-        <w:rPr>
-          <w:rFonts w:eastAsia="Times New Roman" w:cs="Times New Roman"/>
-          <w:szCs w:val="24"/>
-          <w:highlight w:val="lightGray"/>
-          <w:lang w:eastAsia="pt-BR"/>
-        </w:rPr>
-        <w:t>importance</w:t>
-      </w:r>
-      <w:proofErr w:type="spellEnd"/>
+        <w:t>Tabelas de feature importance</w:t>
+      </w:r>
     </w:p>
     <w:p>
       <w:pPr>
@@ -8336,50 +6850,20 @@
       <w:r>
         <w:t xml:space="preserve">) de pacientes com Síndrome Respiratória Aguda Grave (SRAG): </w:t>
       </w:r>
-      <w:proofErr w:type="spellStart"/>
       <w:r>
         <w:rPr>
           <w:rStyle w:val="Forte"/>
         </w:rPr>
-        <w:t>Decision</w:t>
-      </w:r>
-      <w:proofErr w:type="spellEnd"/>
+        <w:t>Decision Tree (CART)</w:t>
+      </w:r>
+      <w:r>
+        <w:t xml:space="preserve"> e </w:t>
+      </w:r>
       <w:r>
         <w:rPr>
           <w:rStyle w:val="Forte"/>
         </w:rPr>
-        <w:t xml:space="preserve"> </w:t>
-      </w:r>
-      <w:proofErr w:type="spellStart"/>
-      <w:r>
-        <w:rPr>
-          <w:rStyle w:val="Forte"/>
-        </w:rPr>
-        <w:t>Tree</w:t>
-      </w:r>
-      <w:proofErr w:type="spellEnd"/>
-      <w:r>
-        <w:rPr>
-          <w:rStyle w:val="Forte"/>
-        </w:rPr>
-        <w:t xml:space="preserve"> (CART)</w:t>
-      </w:r>
-      <w:r>
-        <w:t xml:space="preserve"> e </w:t>
-      </w:r>
-      <w:proofErr w:type="spellStart"/>
-      <w:r>
-        <w:rPr>
-          <w:rStyle w:val="Forte"/>
-        </w:rPr>
-        <w:t>Random</w:t>
-      </w:r>
-      <w:proofErr w:type="spellEnd"/>
-      <w:r>
-        <w:rPr>
-          <w:rStyle w:val="Forte"/>
-        </w:rPr>
-        <w:t xml:space="preserve"> Forest</w:t>
+        <w:t>Random Forest</w:t>
       </w:r>
       <w:r>
         <w:t xml:space="preserve">. Ambos os modelos foram ajustados utilizando </w:t>
@@ -8440,31 +6924,7 @@
           <w:highlight w:val="yellow"/>
           <w:lang w:eastAsia="pt-BR"/>
         </w:rPr>
-        <w:t xml:space="preserve">4.1.1 </w:t>
-      </w:r>
-      <w:proofErr w:type="spellStart"/>
-      <w:r>
-        <w:rPr>
-          <w:rFonts w:eastAsia="Times New Roman" w:cs="Times New Roman"/>
-          <w:b/>
-          <w:bCs/>
-          <w:szCs w:val="24"/>
-          <w:highlight w:val="yellow"/>
-          <w:lang w:eastAsia="pt-BR"/>
-        </w:rPr>
-        <w:t>Random</w:t>
-      </w:r>
-      <w:proofErr w:type="spellEnd"/>
-      <w:r>
-        <w:rPr>
-          <w:rFonts w:eastAsia="Times New Roman" w:cs="Times New Roman"/>
-          <w:b/>
-          <w:bCs/>
-          <w:szCs w:val="24"/>
-          <w:highlight w:val="yellow"/>
-          <w:lang w:eastAsia="pt-BR"/>
-        </w:rPr>
-        <w:t xml:space="preserve"> Forest</w:t>
+        <w:t>4.1.1 Random Forest</w:t>
       </w:r>
       <w:r>
         <w:rPr>
@@ -8581,27 +7041,8 @@
           <w:szCs w:val="24"/>
           <w:lang w:eastAsia="pt-BR"/>
         </w:rPr>
-        <w:t xml:space="preserve">O modelo </w:t>
-      </w:r>
-      <w:proofErr w:type="spellStart"/>
-      <w:r>
-        <w:rPr>
-          <w:rFonts w:eastAsia="Times New Roman" w:cs="Times New Roman"/>
-          <w:szCs w:val="24"/>
-          <w:lang w:eastAsia="pt-BR"/>
-        </w:rPr>
-        <w:t>Random</w:t>
-      </w:r>
-      <w:proofErr w:type="spellEnd"/>
-      <w:r>
-        <w:rPr>
-          <w:rFonts w:eastAsia="Times New Roman" w:cs="Times New Roman"/>
-          <w:szCs w:val="24"/>
-          <w:lang w:eastAsia="pt-BR"/>
-        </w:rPr>
-        <w:t xml:space="preserve"> Forest foi ajustado com </w:t>
-      </w:r>
-      <w:proofErr w:type="spellStart"/>
+        <w:t xml:space="preserve">O modelo Random Forest foi ajustado com </w:t>
+      </w:r>
       <w:r>
         <w:rPr>
           <w:rFonts w:ascii="Courier New" w:eastAsia="Times New Roman" w:hAnsi="Courier New" w:cs="Courier New"/>
@@ -8609,9 +7050,16 @@
           <w:szCs w:val="20"/>
           <w:lang w:eastAsia="pt-BR"/>
         </w:rPr>
-        <w:t>n_estimators</w:t>
-      </w:r>
-      <w:proofErr w:type="spellEnd"/>
+        <w:t>n_estimators=100</w:t>
+      </w:r>
+      <w:r>
+        <w:rPr>
+          <w:rFonts w:eastAsia="Times New Roman" w:cs="Times New Roman"/>
+          <w:szCs w:val="24"/>
+          <w:lang w:eastAsia="pt-BR"/>
+        </w:rPr>
+        <w:t xml:space="preserve">, </w:t>
+      </w:r>
       <w:r>
         <w:rPr>
           <w:rFonts w:ascii="Courier New" w:eastAsia="Times New Roman" w:hAnsi="Courier New" w:cs="Courier New"/>
@@ -8619,7 +7067,7 @@
           <w:szCs w:val="20"/>
           <w:lang w:eastAsia="pt-BR"/>
         </w:rPr>
-        <w:t>=100</w:t>
+        <w:t>max_depth=7</w:t>
       </w:r>
       <w:r>
         <w:rPr>
@@ -8629,7 +7077,6 @@
         </w:rPr>
         <w:t xml:space="preserve">, </w:t>
       </w:r>
-      <w:proofErr w:type="spellStart"/>
       <w:r>
         <w:rPr>
           <w:rFonts w:ascii="Courier New" w:eastAsia="Times New Roman" w:hAnsi="Courier New" w:cs="Courier New"/>
@@ -8637,9 +7084,16 @@
           <w:szCs w:val="20"/>
           <w:lang w:eastAsia="pt-BR"/>
         </w:rPr>
-        <w:t>max_depth</w:t>
-      </w:r>
-      <w:proofErr w:type="spellEnd"/>
+        <w:t>min_samples_leaf=2</w:t>
+      </w:r>
+      <w:r>
+        <w:rPr>
+          <w:rFonts w:eastAsia="Times New Roman" w:cs="Times New Roman"/>
+          <w:szCs w:val="24"/>
+          <w:lang w:eastAsia="pt-BR"/>
+        </w:rPr>
+        <w:t xml:space="preserve"> e </w:t>
+      </w:r>
       <w:r>
         <w:rPr>
           <w:rFonts w:ascii="Courier New" w:eastAsia="Times New Roman" w:hAnsi="Courier New" w:cs="Courier New"/>
@@ -8647,63 +7101,7 @@
           <w:szCs w:val="20"/>
           <w:lang w:eastAsia="pt-BR"/>
         </w:rPr>
-        <w:t>=7</w:t>
-      </w:r>
-      <w:r>
-        <w:rPr>
-          <w:rFonts w:eastAsia="Times New Roman" w:cs="Times New Roman"/>
-          <w:szCs w:val="24"/>
-          <w:lang w:eastAsia="pt-BR"/>
-        </w:rPr>
-        <w:t xml:space="preserve">, </w:t>
-      </w:r>
-      <w:proofErr w:type="spellStart"/>
-      <w:r>
-        <w:rPr>
-          <w:rFonts w:ascii="Courier New" w:eastAsia="Times New Roman" w:hAnsi="Courier New" w:cs="Courier New"/>
-          <w:sz w:val="20"/>
-          <w:szCs w:val="20"/>
-          <w:lang w:eastAsia="pt-BR"/>
-        </w:rPr>
-        <w:t>min_samples_leaf</w:t>
-      </w:r>
-      <w:proofErr w:type="spellEnd"/>
-      <w:r>
-        <w:rPr>
-          <w:rFonts w:ascii="Courier New" w:eastAsia="Times New Roman" w:hAnsi="Courier New" w:cs="Courier New"/>
-          <w:sz w:val="20"/>
-          <w:szCs w:val="20"/>
-          <w:lang w:eastAsia="pt-BR"/>
-        </w:rPr>
-        <w:t>=2</w:t>
-      </w:r>
-      <w:r>
-        <w:rPr>
-          <w:rFonts w:eastAsia="Times New Roman" w:cs="Times New Roman"/>
-          <w:szCs w:val="24"/>
-          <w:lang w:eastAsia="pt-BR"/>
-        </w:rPr>
-        <w:t xml:space="preserve"> e </w:t>
-      </w:r>
-      <w:proofErr w:type="spellStart"/>
-      <w:r>
-        <w:rPr>
-          <w:rFonts w:ascii="Courier New" w:eastAsia="Times New Roman" w:hAnsi="Courier New" w:cs="Courier New"/>
-          <w:sz w:val="20"/>
-          <w:szCs w:val="20"/>
-          <w:lang w:eastAsia="pt-BR"/>
-        </w:rPr>
-        <w:t>min_samples_split</w:t>
-      </w:r>
-      <w:proofErr w:type="spellEnd"/>
-      <w:r>
-        <w:rPr>
-          <w:rFonts w:ascii="Courier New" w:eastAsia="Times New Roman" w:hAnsi="Courier New" w:cs="Courier New"/>
-          <w:sz w:val="20"/>
-          <w:szCs w:val="20"/>
-          <w:lang w:eastAsia="pt-BR"/>
-        </w:rPr>
-        <w:t>=5</w:t>
+        <w:t>min_samples_split=5</w:t>
       </w:r>
       <w:r>
         <w:rPr>
@@ -8898,25 +7296,7 @@
           <w:szCs w:val="24"/>
           <w:lang w:eastAsia="pt-BR"/>
         </w:rPr>
-        <w:t xml:space="preserve"> (Figura 4) evidencia superioridade da </w:t>
-      </w:r>
-      <w:proofErr w:type="spellStart"/>
-      <w:r>
-        <w:rPr>
-          <w:rFonts w:eastAsia="Times New Roman" w:cs="Times New Roman"/>
-          <w:szCs w:val="24"/>
-          <w:lang w:eastAsia="pt-BR"/>
-        </w:rPr>
-        <w:t>Random</w:t>
-      </w:r>
-      <w:proofErr w:type="spellEnd"/>
-      <w:r>
-        <w:rPr>
-          <w:rFonts w:eastAsia="Times New Roman" w:cs="Times New Roman"/>
-          <w:szCs w:val="24"/>
-          <w:lang w:eastAsia="pt-BR"/>
-        </w:rPr>
-        <w:t xml:space="preserve"> Forest em praticamente todas as faixas da taxa de falsos positivos, mantendo maior área sob a curva.</w:t>
+        <w:t xml:space="preserve"> (Figura 4) evidencia superioridade da Random Forest em praticamente todas as faixas da taxa de falsos positivos, mantendo maior área sob a curva.</w:t>
       </w:r>
     </w:p>
     <w:p>
@@ -8975,65 +7355,38 @@
         <w:lastRenderedPageBreak/>
         <w:t xml:space="preserve">O modelo CART foi ajustado com os melhores hiperparâmetros encontrados: </w:t>
       </w:r>
-      <w:proofErr w:type="spellStart"/>
       <w:r>
         <w:rPr>
           <w:rStyle w:val="CdigoHTML"/>
           <w:highlight w:val="lightGray"/>
         </w:rPr>
-        <w:t>max_depth</w:t>
-      </w:r>
-      <w:proofErr w:type="spellEnd"/>
+        <w:t>max_depth=5</w:t>
+      </w:r>
+      <w:r>
+        <w:rPr>
+          <w:highlight w:val="lightGray"/>
+        </w:rPr>
+        <w:t xml:space="preserve">, </w:t>
+      </w:r>
       <w:r>
         <w:rPr>
           <w:rStyle w:val="CdigoHTML"/>
           <w:highlight w:val="lightGray"/>
         </w:rPr>
-        <w:t>=5</w:t>
-      </w:r>
-      <w:r>
-        <w:rPr>
-          <w:highlight w:val="lightGray"/>
-        </w:rPr>
-        <w:t xml:space="preserve">, </w:t>
-      </w:r>
-      <w:proofErr w:type="spellStart"/>
+        <w:t>min_samples_leaf=1</w:t>
+      </w:r>
+      <w:r>
+        <w:rPr>
+          <w:highlight w:val="lightGray"/>
+        </w:rPr>
+        <w:t xml:space="preserve"> e </w:t>
+      </w:r>
       <w:r>
         <w:rPr>
           <w:rStyle w:val="CdigoHTML"/>
           <w:highlight w:val="lightGray"/>
         </w:rPr>
-        <w:t>min_samples_leaf</w:t>
-      </w:r>
-      <w:proofErr w:type="spellEnd"/>
-      <w:r>
-        <w:rPr>
-          <w:rStyle w:val="CdigoHTML"/>
-          <w:highlight w:val="lightGray"/>
-        </w:rPr>
-        <w:t>=1</w:t>
-      </w:r>
-      <w:r>
-        <w:rPr>
-          <w:highlight w:val="lightGray"/>
-        </w:rPr>
-        <w:t xml:space="preserve"> e </w:t>
-      </w:r>
-      <w:proofErr w:type="spellStart"/>
-      <w:r>
-        <w:rPr>
-          <w:rStyle w:val="CdigoHTML"/>
-          <w:highlight w:val="lightGray"/>
-        </w:rPr>
-        <w:t>min_samples_split</w:t>
-      </w:r>
-      <w:proofErr w:type="spellEnd"/>
-      <w:r>
-        <w:rPr>
-          <w:rStyle w:val="CdigoHTML"/>
-          <w:highlight w:val="lightGray"/>
-        </w:rPr>
-        <w:t>=2</w:t>
+        <w:t>min_samples_split=2</w:t>
       </w:r>
       <w:r>
         <w:rPr>
@@ -9589,7 +7942,6 @@
                 <w:lang w:eastAsia="pt-BR"/>
               </w:rPr>
             </w:pPr>
-            <w:proofErr w:type="spellStart"/>
             <w:r>
               <w:rPr>
                 <w:rFonts w:eastAsia="Times New Roman" w:cs="Times New Roman"/>
@@ -9600,7 +7952,6 @@
               </w:rPr>
               <w:t>Accuracy</w:t>
             </w:r>
-            <w:proofErr w:type="spellEnd"/>
           </w:p>
         </w:tc>
         <w:tc>
@@ -9621,7 +7972,6 @@
                 <w:lang w:eastAsia="pt-BR"/>
               </w:rPr>
             </w:pPr>
-            <w:proofErr w:type="spellStart"/>
             <w:r>
               <w:rPr>
                 <w:rFonts w:eastAsia="Times New Roman" w:cs="Times New Roman"/>
@@ -9632,7 +7982,6 @@
               </w:rPr>
               <w:t>Precision</w:t>
             </w:r>
-            <w:proofErr w:type="spellEnd"/>
           </w:p>
         </w:tc>
         <w:tc>
@@ -9847,23 +8196,13 @@
                 <w:lang w:eastAsia="pt-BR"/>
               </w:rPr>
             </w:pPr>
-            <w:proofErr w:type="spellStart"/>
             <w:r>
               <w:rPr>
                 <w:rFonts w:eastAsia="Times New Roman" w:cs="Times New Roman"/>
                 <w:szCs w:val="24"/>
                 <w:lang w:eastAsia="pt-BR"/>
               </w:rPr>
-              <w:t>Random</w:t>
-            </w:r>
-            <w:proofErr w:type="spellEnd"/>
-            <w:r>
-              <w:rPr>
-                <w:rFonts w:eastAsia="Times New Roman" w:cs="Times New Roman"/>
-                <w:szCs w:val="24"/>
-                <w:lang w:eastAsia="pt-BR"/>
-              </w:rPr>
-              <w:t xml:space="preserve"> Forest</w:t>
+              <w:t>Random Forest</w:t>
             </w:r>
           </w:p>
         </w:tc>
@@ -10026,23 +8365,7 @@
         </w:rPr>
       </w:pPr>
       <w:r>
-        <w:t xml:space="preserve"># </w:t>
-      </w:r>
-      <w:proofErr w:type="spellStart"/>
-      <w:r>
-        <w:t>Interpretação</w:t>
-      </w:r>
-      <w:proofErr w:type="spellEnd"/>
-      <w:r>
-        <w:t xml:space="preserve"> </w:t>
-      </w:r>
-      <w:proofErr w:type="spellStart"/>
-      <w:r>
-        <w:t>Clínica</w:t>
-      </w:r>
-      <w:proofErr w:type="spellEnd"/>
-      <w:r>
-        <w:t xml:space="preserve"> e Técnica</w:t>
+        <w:t># Interpretação Clínica e Técnica</w:t>
       </w:r>
     </w:p>
     <w:p>
@@ -10262,15 +8585,7 @@
         <w:t>2</w:t>
       </w:r>
       <w:r>
-        <w:t xml:space="preserve"> – Matrizes de confusão comparando CART e </w:t>
-      </w:r>
-      <w:proofErr w:type="spellStart"/>
-      <w:r>
-        <w:t>Random</w:t>
-      </w:r>
-      <w:proofErr w:type="spellEnd"/>
-      <w:r>
-        <w:t xml:space="preserve"> Forest.</w:t>
+        <w:t xml:space="preserve"> – Matrizes de confusão comparando CART e Random Forest.</w:t>
       </w:r>
     </w:p>
     <w:p>
@@ -10341,15 +8656,7 @@
         <w:t>3</w:t>
       </w:r>
       <w:r>
-        <w:t xml:space="preserve"> – Curva ROC comparativa entre CART e </w:t>
-      </w:r>
-      <w:proofErr w:type="spellStart"/>
-      <w:r>
-        <w:t>Random</w:t>
-      </w:r>
-      <w:proofErr w:type="spellEnd"/>
-      <w:r>
-        <w:t xml:space="preserve"> Forest.</w:t>
+        <w:t xml:space="preserve"> – Curva ROC comparativa entre CART e Random Forest.</w:t>
       </w:r>
     </w:p>
     <w:p>
@@ -11063,23 +9370,13 @@
           <w:sz w:val="27"/>
         </w:rPr>
       </w:pPr>
-      <w:proofErr w:type="spellStart"/>
       <w:r>
         <w:rPr>
           <w:rStyle w:val="Forte"/>
           <w:b/>
           <w:bCs w:val="0"/>
         </w:rPr>
-        <w:t>Interpretação</w:t>
-      </w:r>
-      <w:proofErr w:type="spellEnd"/>
-      <w:r>
-        <w:rPr>
-          <w:rStyle w:val="Forte"/>
-          <w:b/>
-          <w:bCs w:val="0"/>
-        </w:rPr>
-        <w:t xml:space="preserve"> Técnica</w:t>
+        <w:t>Interpretação Técnica</w:t>
       </w:r>
     </w:p>
     <w:p>
@@ -11098,15 +9395,7 @@
         <w:t>PC Geraldo</w:t>
       </w:r>
       <w:r>
-        <w:t xml:space="preserve"> teve o melhor desempenho, mesmo com apenas 8GB de RAM e um </w:t>
-      </w:r>
-      <w:proofErr w:type="spellStart"/>
-      <w:r>
-        <w:t>Ryzen</w:t>
-      </w:r>
-      <w:proofErr w:type="spellEnd"/>
-      <w:r>
-        <w:t xml:space="preserve"> 1600x (CPU com boa performance por núcleo). Isso pode ser devido ao Fedora ser um SO leve e o código estar mais otimizado para uso local, com menor overhead de virtualização.</w:t>
+        <w:t xml:space="preserve"> teve o melhor desempenho, mesmo com apenas 8GB de RAM e um Ryzen 1600x (CPU com boa performance por núcleo). Isso pode ser devido ao Fedora ser um SO leve e o código estar mais otimizado para uso local, com menor overhead de virtualização.</w:t>
       </w:r>
     </w:p>
     <w:p>
@@ -11134,15 +9423,7 @@
         <w:t>Xeon E5620</w:t>
       </w:r>
       <w:r>
-        <w:t xml:space="preserve">, que tem </w:t>
-      </w:r>
-      <w:proofErr w:type="spellStart"/>
-      <w:r>
-        <w:t>clock</w:t>
-      </w:r>
-      <w:proofErr w:type="spellEnd"/>
-      <w:r>
-        <w:t xml:space="preserve"> mais baixo e menor eficiência por núcleo. O tempo ainda foi bom, mas não foi o mais rápido.</w:t>
+        <w:t>, que tem clock mais baixo e menor eficiência por núcleo. O tempo ainda foi bom, mas não foi o mais rápido.</w:t>
       </w:r>
     </w:p>
     <w:p>
@@ -11171,31 +9452,7 @@
         <w:t>pior tempo</w:t>
       </w:r>
       <w:r>
-        <w:t xml:space="preserve">, possivelmente por estar executando em um ambiente com mais processos paralelos em segundo plano (SO Windows ou virtualização via </w:t>
-      </w:r>
-      <w:proofErr w:type="spellStart"/>
-      <w:r>
-        <w:t>Jupyter</w:t>
-      </w:r>
-      <w:proofErr w:type="spellEnd"/>
-      <w:r>
-        <w:t>/</w:t>
-      </w:r>
-      <w:proofErr w:type="spellStart"/>
-      <w:r>
-        <w:t>Colab</w:t>
-      </w:r>
-      <w:proofErr w:type="spellEnd"/>
-      <w:r>
-        <w:t xml:space="preserve"> local), além de </w:t>
-      </w:r>
-      <w:proofErr w:type="spellStart"/>
-      <w:r>
-        <w:t>throttling</w:t>
-      </w:r>
-      <w:proofErr w:type="spellEnd"/>
-      <w:r>
-        <w:t xml:space="preserve"> térmico ou economia de energia.</w:t>
+        <w:t>, possivelmente por estar executando em um ambiente com mais processos paralelos em segundo plano (SO Windows ou virtualização via Jupyter/Colab local), além de throttling térmico ou economia de energia.</w:t>
       </w:r>
     </w:p>
     <w:p>
@@ -11249,24 +9506,14 @@
         <w:pStyle w:val="NormalWeb"/>
       </w:pPr>
       <w:r>
-        <w:t xml:space="preserve">Aqui está o gráfico comparativo de tempo de execução do </w:t>
-      </w:r>
-      <w:proofErr w:type="gramStart"/>
-      <w:r>
-        <w:t>modelo</w:t>
-      </w:r>
-      <w:proofErr w:type="gramEnd"/>
-      <w:r>
-        <w:t xml:space="preserve"> </w:t>
-      </w:r>
-      <w:proofErr w:type="spellStart"/>
+        <w:t xml:space="preserve">Aqui está o gráfico comparativo de tempo de execução do modelo </w:t>
+      </w:r>
       <w:r>
         <w:rPr>
           <w:rStyle w:val="CdigoHTML"/>
         </w:rPr>
         <w:t>modelo_real_collab</w:t>
       </w:r>
-      <w:proofErr w:type="spellEnd"/>
       <w:r>
         <w:t xml:space="preserve"> em cada máquina. Ele mostra claramente que:</w:t>
       </w:r>
@@ -11312,15 +9559,7 @@
         <w:t>PC Iasmin</w:t>
       </w:r>
       <w:r>
-        <w:t xml:space="preserve"> teve o maior tempo total, especialmente no </w:t>
-      </w:r>
-      <w:proofErr w:type="spellStart"/>
-      <w:r>
-        <w:t>Random</w:t>
-      </w:r>
-      <w:proofErr w:type="spellEnd"/>
-      <w:r>
-        <w:t xml:space="preserve"> Forest.</w:t>
+        <w:t xml:space="preserve"> teve o maior tempo total, especialmente no Random Forest.</w:t>
       </w:r>
     </w:p>
     <w:p>
@@ -11371,15 +9610,7 @@
         <w:pStyle w:val="NormalWeb"/>
       </w:pPr>
       <w:r>
-        <w:t xml:space="preserve">Os experimentos foram executados em três máquinas com configurações distintas, a fim de avaliar o impacto do ambiente computacional na eficiência de compilação do modelo. Curiosamente, o tempo total de execução mais rápido foi registrado no PC Geraldo, com 30 segundos, apesar de possuir apenas 8GB de RAM, demonstrando que fatores como sistema operacional e uso de recursos locais podem influenciar significativamente a performance computacional. O Cluster da UFES apresentou desempenho intermediário, enquanto o PC Iasmin, embora com melhor especificação de memória e CPU, foi o mais lento, possivelmente devido </w:t>
-      </w:r>
-      <w:proofErr w:type="spellStart"/>
-      <w:r>
-        <w:t>a</w:t>
-      </w:r>
-      <w:proofErr w:type="spellEnd"/>
-      <w:r>
-        <w:t xml:space="preserve"> limitações de gerenciamento térmico, energia ou overhead do ambiente. Esse resultado reforça a importância de considerar o contexto computacional ao avaliar a viabilidade de aplicação de modelos preditivos em cenários clínicos reais.</w:t>
+        <w:t>Os experimentos foram executados em três máquinas com configurações distintas, a fim de avaliar o impacto do ambiente computacional na eficiência de compilação do modelo. Curiosamente, o tempo total de execução mais rápido foi registrado no PC Geraldo, com 30 segundos, apesar de possuir apenas 8GB de RAM, demonstrando que fatores como sistema operacional e uso de recursos locais podem influenciar significativamente a performance computacional. O Cluster da UFES apresentou desempenho intermediário, enquanto o PC Iasmin, embora com melhor especificação de memória e CPU, foi o mais lento, possivelmente devido a limitações de gerenciamento térmico, energia ou overhead do ambiente. Esse resultado reforça a importância de considerar o contexto computacional ao avaliar a viabilidade de aplicação de modelos preditivos em cenários clínicos reais.</w:t>
       </w:r>
     </w:p>
     <w:p>
@@ -11453,34 +9684,14 @@
           <w:numId w:val="33"/>
         </w:numPr>
       </w:pPr>
-      <w:proofErr w:type="spellStart"/>
       <w:r>
         <w:rPr>
           <w:rStyle w:val="Forte"/>
           <w:b/>
           <w:bCs w:val="0"/>
         </w:rPr>
-        <w:t>Interpretação</w:t>
-      </w:r>
-      <w:proofErr w:type="spellEnd"/>
-      <w:r>
-        <w:rPr>
-          <w:rStyle w:val="Forte"/>
-          <w:b/>
-          <w:bCs w:val="0"/>
-        </w:rPr>
-        <w:t xml:space="preserve"> Técnica dos </w:t>
-      </w:r>
-      <w:proofErr w:type="spellStart"/>
-      <w:r>
-        <w:rPr>
-          <w:rStyle w:val="Forte"/>
-          <w:b/>
-          <w:bCs w:val="0"/>
-        </w:rPr>
-        <w:t>Resultados</w:t>
-      </w:r>
-      <w:proofErr w:type="spellEnd"/>
+        <w:t>Interpretação Técnica dos Resultados</w:t>
+      </w:r>
     </w:p>
     <w:p>
       <w:pPr>
@@ -11546,15 +9757,7 @@
         <w:t>PC Iasmin teve o pior desempenho</w:t>
       </w:r>
       <w:r>
-        <w:t xml:space="preserve">, mesmo com mais RAM e CPU moderna. A possível causa: </w:t>
-      </w:r>
-      <w:proofErr w:type="spellStart"/>
-      <w:r>
-        <w:t>throttling</w:t>
-      </w:r>
-      <w:proofErr w:type="spellEnd"/>
-      <w:r>
-        <w:t xml:space="preserve"> térmico, múltiplos processos simultâneos, modo de energia e overhead do sistema (provavelmente Windows).</w:t>
+        <w:t>, mesmo com mais RAM e CPU moderna. A possível causa: throttling térmico, múltiplos processos simultâneos, modo de energia e overhead do sistema (provavelmente Windows).</w:t>
       </w:r>
     </w:p>
     <w:p>
@@ -11661,15 +9864,7 @@
         <w:t>otimização do ambiente de execução é tão importante quanto o hardware</w:t>
       </w:r>
       <w:r>
-        <w:t xml:space="preserve">, o que pode abrir espaço para futuras investigações sobre </w:t>
-      </w:r>
-      <w:proofErr w:type="spellStart"/>
-      <w:r>
-        <w:t>deployment</w:t>
-      </w:r>
-      <w:proofErr w:type="spellEnd"/>
-      <w:r>
-        <w:t>.</w:t>
+        <w:t>, o que pode abrir espaço para futuras investigações sobre deployment.</w:t>
       </w:r>
     </w:p>
     <w:p>
@@ -11699,23 +9894,7 @@
         <w:pStyle w:val="NormalWeb"/>
       </w:pPr>
       <w:r>
-        <w:t xml:space="preserve">Para avaliar a viabilidade computacional da aplicação do modelo preditivo desenvolvido, o notebook </w:t>
-      </w:r>
-      <w:proofErr w:type="spellStart"/>
-      <w:r>
-        <w:t>modelo_real_collab</w:t>
-      </w:r>
-      <w:proofErr w:type="spellEnd"/>
-      <w:r>
-        <w:t xml:space="preserve"> foi executado em três ambientes distintos: um computador pessoal com Fedora (PC Geraldo), o cluster institucional da UFES e um notebook pessoal com Windows (PC Iasmin). Curiosamente, o menor tempo de execução foi observado no PC Geraldo (30.07s), mesmo sendo a máquina com menor quantidade de RAM (8GB) e um processador mais antigo (</w:t>
-      </w:r>
-      <w:proofErr w:type="spellStart"/>
-      <w:r>
-        <w:t>Ryzen</w:t>
-      </w:r>
-      <w:proofErr w:type="spellEnd"/>
-      <w:r>
-        <w:t xml:space="preserve"> 1600x). O Cluster UFES apresentou tempo intermediário (82.32s), enquanto o PC Iasmin, com hardware mais recente, foi o mais lento (129.82s).</w:t>
+        <w:t>Para avaliar a viabilidade computacional da aplicação do modelo preditivo desenvolvido, o notebook modelo_real_collab foi executado em três ambientes distintos: um computador pessoal com Fedora (PC Geraldo), o cluster institucional da UFES e um notebook pessoal com Windows (PC Iasmin). Curiosamente, o menor tempo de execução foi observado no PC Geraldo (30.07s), mesmo sendo a máquina com menor quantidade de RAM (8GB) e um processador mais antigo (Ryzen 1600x). O Cluster UFES apresentou tempo intermediário (82.32s), enquanto o PC Iasmin, com hardware mais recente, foi o mais lento (129.82s).</w:t>
       </w:r>
     </w:p>
     <w:p>
@@ -11761,13 +9940,8 @@
         <w:spacing w:before="100" w:beforeAutospacing="1" w:after="100" w:afterAutospacing="1" w:line="240" w:lineRule="auto"/>
         <w:jc w:val="left"/>
       </w:pPr>
-      <w:proofErr w:type="gramStart"/>
-      <w:r>
-        <w:t>[ ]</w:t>
-      </w:r>
-      <w:proofErr w:type="gramEnd"/>
-      <w:r>
-        <w:t xml:space="preserve"> mas talvez utilizar de uma forma mais visual e que um usuário leigo/ comum possa aproveitar da ferramenta;</w:t>
+      <w:r>
+        <w:t>[ ] mas talvez utilizar de uma forma mais visual e que um usuário leigo/ comum possa aproveitar da ferramenta;</w:t>
       </w:r>
     </w:p>
     <w:p>
@@ -11779,13 +9953,8 @@
         <w:spacing w:before="100" w:beforeAutospacing="1" w:after="100" w:afterAutospacing="1" w:line="240" w:lineRule="auto"/>
         <w:jc w:val="left"/>
       </w:pPr>
-      <w:proofErr w:type="gramStart"/>
-      <w:r>
-        <w:t>[ ]</w:t>
-      </w:r>
-      <w:proofErr w:type="gramEnd"/>
-      <w:r>
-        <w:t xml:space="preserve"> adicionar a essa seção a importância da máquina para análise de grandes dados faz a diferença no tempo de processamento e como isso afeta diretamente </w:t>
+      <w:r>
+        <w:t xml:space="preserve">[ ] adicionar a essa seção a importância da máquina para análise de grandes dados faz a diferença no tempo de processamento e como isso afeta diretamente </w:t>
       </w:r>
       <w:r>
         <w:lastRenderedPageBreak/>
@@ -11842,79 +10011,7 @@
           <w:highlight w:val="yellow"/>
           <w:lang w:eastAsia="pt-BR"/>
         </w:rPr>
-        <w:t xml:space="preserve">1.3 Síntese Comparativa: </w:t>
-      </w:r>
-      <w:proofErr w:type="spellStart"/>
-      <w:r>
-        <w:rPr>
-          <w:rFonts w:eastAsia="Times New Roman" w:cs="Times New Roman"/>
-          <w:b/>
-          <w:bCs/>
-          <w:szCs w:val="24"/>
-          <w:highlight w:val="yellow"/>
-          <w:lang w:eastAsia="pt-BR"/>
-        </w:rPr>
-        <w:t>Random</w:t>
-      </w:r>
-      <w:proofErr w:type="spellEnd"/>
-      <w:r>
-        <w:rPr>
-          <w:rFonts w:eastAsia="Times New Roman" w:cs="Times New Roman"/>
-          <w:b/>
-          <w:bCs/>
-          <w:szCs w:val="24"/>
-          <w:highlight w:val="yellow"/>
-          <w:lang w:eastAsia="pt-BR"/>
-        </w:rPr>
-        <w:t xml:space="preserve"> Forest </w:t>
-      </w:r>
-      <w:proofErr w:type="spellStart"/>
-      <w:r>
-        <w:rPr>
-          <w:rFonts w:eastAsia="Times New Roman" w:cs="Times New Roman"/>
-          <w:b/>
-          <w:bCs/>
-          <w:szCs w:val="24"/>
-          <w:highlight w:val="yellow"/>
-          <w:lang w:eastAsia="pt-BR"/>
-        </w:rPr>
-        <w:t>vs</w:t>
-      </w:r>
-      <w:proofErr w:type="spellEnd"/>
-      <w:r>
-        <w:rPr>
-          <w:rFonts w:eastAsia="Times New Roman" w:cs="Times New Roman"/>
-          <w:b/>
-          <w:bCs/>
-          <w:szCs w:val="24"/>
-          <w:highlight w:val="yellow"/>
-          <w:lang w:eastAsia="pt-BR"/>
-        </w:rPr>
-        <w:t xml:space="preserve"> CART [</w:t>
-      </w:r>
-      <w:proofErr w:type="spellStart"/>
-      <w:r>
-        <w:rPr>
-          <w:rFonts w:eastAsia="Times New Roman" w:cs="Times New Roman"/>
-          <w:b/>
-          <w:bCs/>
-          <w:szCs w:val="24"/>
-          <w:highlight w:val="yellow"/>
-          <w:lang w:eastAsia="pt-BR"/>
-        </w:rPr>
-        <w:t>nao</w:t>
-      </w:r>
-      <w:proofErr w:type="spellEnd"/>
-      <w:r>
-        <w:rPr>
-          <w:rFonts w:eastAsia="Times New Roman" w:cs="Times New Roman"/>
-          <w:b/>
-          <w:bCs/>
-          <w:szCs w:val="24"/>
-          <w:highlight w:val="yellow"/>
-          <w:lang w:eastAsia="pt-BR"/>
-        </w:rPr>
-        <w:t xml:space="preserve"> tenho certeza se vou deixar]</w:t>
+        <w:t>1.3 Síntese Comparativa: Random Forest vs CART [nao tenho certeza se vou deixar]</w:t>
       </w:r>
     </w:p>
     <w:p>
@@ -11931,23 +10028,13 @@
           <w:lang w:eastAsia="pt-BR"/>
         </w:rPr>
       </w:pPr>
-      <w:proofErr w:type="gramStart"/>
-      <w:r>
-        <w:rPr>
-          <w:rFonts w:eastAsia="Times New Roman" w:cs="Times New Roman"/>
-          <w:szCs w:val="24"/>
-          <w:lang w:eastAsia="pt-BR"/>
-        </w:rPr>
-        <w:t>[ ]</w:t>
-      </w:r>
-      <w:proofErr w:type="gramEnd"/>
-      <w:r>
-        <w:rPr>
-          <w:rFonts w:eastAsia="Times New Roman" w:cs="Times New Roman"/>
-          <w:szCs w:val="24"/>
-          <w:lang w:eastAsia="pt-BR"/>
-        </w:rPr>
-        <w:t xml:space="preserve"> Verificar</w:t>
+      <w:r>
+        <w:rPr>
+          <w:rFonts w:eastAsia="Times New Roman" w:cs="Times New Roman"/>
+          <w:szCs w:val="24"/>
+          <w:lang w:eastAsia="pt-BR"/>
+        </w:rPr>
+        <w:t>[ ] Verificar</w:t>
       </w:r>
     </w:p>
     <w:p>
@@ -11970,43 +10057,7 @@
           <w:szCs w:val="24"/>
           <w:lang w:eastAsia="pt-BR"/>
         </w:rPr>
-        <w:t>Tabela com métricas (</w:t>
-      </w:r>
-      <w:proofErr w:type="spellStart"/>
-      <w:r>
-        <w:rPr>
-          <w:rFonts w:eastAsia="Times New Roman" w:cs="Times New Roman"/>
-          <w:szCs w:val="24"/>
-          <w:lang w:eastAsia="pt-BR"/>
-        </w:rPr>
-        <w:t>Random</w:t>
-      </w:r>
-      <w:proofErr w:type="spellEnd"/>
-      <w:r>
-        <w:rPr>
-          <w:rFonts w:eastAsia="Times New Roman" w:cs="Times New Roman"/>
-          <w:szCs w:val="24"/>
-          <w:lang w:eastAsia="pt-BR"/>
-        </w:rPr>
-        <w:t xml:space="preserve"> Forest </w:t>
-      </w:r>
-      <w:proofErr w:type="spellStart"/>
-      <w:r>
-        <w:rPr>
-          <w:rFonts w:eastAsia="Times New Roman" w:cs="Times New Roman"/>
-          <w:szCs w:val="24"/>
-          <w:lang w:eastAsia="pt-BR"/>
-        </w:rPr>
-        <w:t>vs</w:t>
-      </w:r>
-      <w:proofErr w:type="spellEnd"/>
-      <w:r>
-        <w:rPr>
-          <w:rFonts w:eastAsia="Times New Roman" w:cs="Times New Roman"/>
-          <w:szCs w:val="24"/>
-          <w:lang w:eastAsia="pt-BR"/>
-        </w:rPr>
-        <w:t xml:space="preserve"> CART).</w:t>
+        <w:t>Tabela com métricas (Random Forest vs CART).</w:t>
       </w:r>
     </w:p>
     <w:p>
@@ -12052,25 +10103,7 @@
           <w:szCs w:val="24"/>
           <w:lang w:eastAsia="pt-BR"/>
         </w:rPr>
-        <w:t xml:space="preserve">Gráficos de importância das </w:t>
-      </w:r>
-      <w:proofErr w:type="spellStart"/>
-      <w:r>
-        <w:rPr>
-          <w:rFonts w:eastAsia="Times New Roman" w:cs="Times New Roman"/>
-          <w:szCs w:val="24"/>
-          <w:lang w:eastAsia="pt-BR"/>
-        </w:rPr>
-        <w:t>features</w:t>
-      </w:r>
-      <w:proofErr w:type="spellEnd"/>
-      <w:r>
-        <w:rPr>
-          <w:rFonts w:eastAsia="Times New Roman" w:cs="Times New Roman"/>
-          <w:szCs w:val="24"/>
-          <w:lang w:eastAsia="pt-BR"/>
-        </w:rPr>
-        <w:t>.</w:t>
+        <w:t>Gráficos de importância das features.</w:t>
       </w:r>
     </w:p>
     <w:p>
@@ -12080,33 +10113,15 @@
         </w:rPr>
       </w:pPr>
       <w:r>
-        <w:t xml:space="preserve">Embora o modelo </w:t>
-      </w:r>
-      <w:proofErr w:type="spellStart"/>
-      <w:r>
-        <w:t>Random</w:t>
-      </w:r>
-      <w:proofErr w:type="spellEnd"/>
-      <w:r>
-        <w:t xml:space="preserve"> Forest tenha apresentado desempenho levemente superior ao CART, o modelo de árvore de decisão tem a vantagem de </w:t>
-      </w:r>
-      <w:proofErr w:type="spellStart"/>
+        <w:t xml:space="preserve">Embora o modelo Random Forest tenha apresentado desempenho levemente superior ao CART, o modelo de árvore de decisão tem a vantagem de </w:t>
+      </w:r>
       <w:r>
         <w:rPr>
           <w:rStyle w:val="notion-enable-hover"/>
           <w:b/>
           <w:bCs/>
         </w:rPr>
-        <w:t>interpretabilidade</w:t>
-      </w:r>
-      <w:proofErr w:type="spellEnd"/>
-      <w:r>
-        <w:rPr>
-          <w:rStyle w:val="notion-enable-hover"/>
-          <w:b/>
-          <w:bCs/>
-        </w:rPr>
-        <w:t xml:space="preserve"> direta</w:t>
+        <w:t>interpretabilidade direta</w:t>
       </w:r>
       <w:r>
         <w:t>, útil para aplicações clínicas e explicações em contexto médico. Ambos os modelos se mostraram viáveis para uso preditivo, com potencial de auxiliar a triagem de pacientes com maior risco de óbito e otimizar recursos hospitalares em unidades do SUS.</w:t>
@@ -12282,47 +10297,7 @@
           <w:highlight w:val="lightGray"/>
           <w:lang w:eastAsia="pt-BR"/>
         </w:rPr>
-        <w:t>Interpretação das variáveis mais relevantes (</w:t>
-      </w:r>
-      <w:proofErr w:type="spellStart"/>
-      <w:r>
-        <w:rPr>
-          <w:rFonts w:eastAsia="Times New Roman" w:cs="Times New Roman"/>
-          <w:szCs w:val="24"/>
-          <w:highlight w:val="lightGray"/>
-          <w:lang w:eastAsia="pt-BR"/>
-        </w:rPr>
-        <w:t>feature</w:t>
-      </w:r>
-      <w:proofErr w:type="spellEnd"/>
-      <w:r>
-        <w:rPr>
-          <w:rFonts w:eastAsia="Times New Roman" w:cs="Times New Roman"/>
-          <w:szCs w:val="24"/>
-          <w:highlight w:val="lightGray"/>
-          <w:lang w:eastAsia="pt-BR"/>
-        </w:rPr>
-        <w:t xml:space="preserve"> </w:t>
-      </w:r>
-      <w:proofErr w:type="spellStart"/>
-      <w:r>
-        <w:rPr>
-          <w:rFonts w:eastAsia="Times New Roman" w:cs="Times New Roman"/>
-          <w:szCs w:val="24"/>
-          <w:highlight w:val="lightGray"/>
-          <w:lang w:eastAsia="pt-BR"/>
-        </w:rPr>
-        <w:t>importance</w:t>
-      </w:r>
-      <w:proofErr w:type="spellEnd"/>
-      <w:r>
-        <w:rPr>
-          <w:rFonts w:eastAsia="Times New Roman" w:cs="Times New Roman"/>
-          <w:szCs w:val="24"/>
-          <w:highlight w:val="lightGray"/>
-          <w:lang w:eastAsia="pt-BR"/>
-        </w:rPr>
-        <w:t>)</w:t>
+        <w:t>Interpretação das variáveis mais relevantes (feature importance)</w:t>
       </w:r>
     </w:p>
     <w:p>
@@ -12347,27 +10322,7 @@
           <w:highlight w:val="lightGray"/>
           <w:lang w:eastAsia="pt-BR"/>
         </w:rPr>
-        <w:t>Discussão sobre limitações (</w:t>
-      </w:r>
-      <w:proofErr w:type="spellStart"/>
-      <w:r>
-        <w:rPr>
-          <w:rFonts w:eastAsia="Times New Roman" w:cs="Times New Roman"/>
-          <w:szCs w:val="24"/>
-          <w:highlight w:val="lightGray"/>
-          <w:lang w:eastAsia="pt-BR"/>
-        </w:rPr>
-        <w:t>ex</w:t>
-      </w:r>
-      <w:proofErr w:type="spellEnd"/>
-      <w:r>
-        <w:rPr>
-          <w:rFonts w:eastAsia="Times New Roman" w:cs="Times New Roman"/>
-          <w:szCs w:val="24"/>
-          <w:highlight w:val="lightGray"/>
-          <w:lang w:eastAsia="pt-BR"/>
-        </w:rPr>
-        <w:t>: qualidade dos dados, falta de variáveis clínicas detalhadas, etc.)</w:t>
+        <w:t>Discussão sobre limitações (ex: qualidade dos dados, falta de variáveis clínicas detalhadas, etc.)</w:t>
       </w:r>
     </w:p>
     <w:p>
@@ -12496,43 +10451,7 @@
           <w:szCs w:val="24"/>
           <w:lang w:eastAsia="pt-BR"/>
         </w:rPr>
-        <w:t>Há trade-</w:t>
-      </w:r>
-      <w:proofErr w:type="spellStart"/>
-      <w:r>
-        <w:rPr>
-          <w:rFonts w:eastAsia="Times New Roman" w:cs="Times New Roman"/>
-          <w:szCs w:val="24"/>
-          <w:lang w:eastAsia="pt-BR"/>
-        </w:rPr>
-        <w:t>offs</w:t>
-      </w:r>
-      <w:proofErr w:type="spellEnd"/>
-      <w:r>
-        <w:rPr>
-          <w:rFonts w:eastAsia="Times New Roman" w:cs="Times New Roman"/>
-          <w:szCs w:val="24"/>
-          <w:lang w:eastAsia="pt-BR"/>
-        </w:rPr>
-        <w:t xml:space="preserve"> entre acurácia e </w:t>
-      </w:r>
-      <w:proofErr w:type="spellStart"/>
-      <w:r>
-        <w:rPr>
-          <w:rFonts w:eastAsia="Times New Roman" w:cs="Times New Roman"/>
-          <w:szCs w:val="24"/>
-          <w:lang w:eastAsia="pt-BR"/>
-        </w:rPr>
-        <w:t>interpretabilidade</w:t>
-      </w:r>
-      <w:proofErr w:type="spellEnd"/>
-      <w:r>
-        <w:rPr>
-          <w:rFonts w:eastAsia="Times New Roman" w:cs="Times New Roman"/>
-          <w:szCs w:val="24"/>
-          <w:lang w:eastAsia="pt-BR"/>
-        </w:rPr>
-        <w:t>?</w:t>
+        <w:t>Há trade-offs entre acurácia e interpretabilidade?</w:t>
       </w:r>
     </w:p>
     <w:p>
@@ -12601,25 +10520,7 @@
           <w:szCs w:val="24"/>
           <w:lang w:eastAsia="pt-BR"/>
         </w:rPr>
-        <w:t xml:space="preserve">O CART oferece maior </w:t>
-      </w:r>
-      <w:proofErr w:type="spellStart"/>
-      <w:r>
-        <w:rPr>
-          <w:rFonts w:eastAsia="Times New Roman" w:cs="Times New Roman"/>
-          <w:szCs w:val="24"/>
-          <w:lang w:eastAsia="pt-BR"/>
-        </w:rPr>
-        <w:t>interpretabilidade</w:t>
-      </w:r>
-      <w:proofErr w:type="spellEnd"/>
-      <w:r>
-        <w:rPr>
-          <w:rFonts w:eastAsia="Times New Roman" w:cs="Times New Roman"/>
-          <w:szCs w:val="24"/>
-          <w:lang w:eastAsia="pt-BR"/>
-        </w:rPr>
-        <w:t xml:space="preserve"> e é computacionalmente mais leve.</w:t>
+        <w:t>O CART oferece maior interpretabilidade e é computacionalmente mais leve.</w:t>
       </w:r>
     </w:p>
     <w:p>
@@ -12642,25 +10543,7 @@
           <w:szCs w:val="24"/>
           <w:lang w:eastAsia="pt-BR"/>
         </w:rPr>
-        <w:t xml:space="preserve">Em ambientes clínicos com restrição de hardware, ambos os modelos </w:t>
-      </w:r>
-      <w:proofErr w:type="gramStart"/>
-      <w:r>
-        <w:rPr>
-          <w:rFonts w:eastAsia="Times New Roman" w:cs="Times New Roman"/>
-          <w:szCs w:val="24"/>
-          <w:lang w:eastAsia="pt-BR"/>
-        </w:rPr>
-        <w:t>mostraram-se</w:t>
-      </w:r>
-      <w:proofErr w:type="gramEnd"/>
-      <w:r>
-        <w:rPr>
-          <w:rFonts w:eastAsia="Times New Roman" w:cs="Times New Roman"/>
-          <w:szCs w:val="24"/>
-          <w:lang w:eastAsia="pt-BR"/>
-        </w:rPr>
-        <w:t xml:space="preserve"> viáveis, com tempo de execução inferior a 2 minutos.</w:t>
+        <w:t>Em ambientes clínicos com restrição de hardware, ambos os modelos mostraram-se viáveis, com tempo de execução inferior a 2 minutos.</w:t>
       </w:r>
     </w:p>
     <w:p>
@@ -12865,67 +10748,7 @@
           <w:highlight w:val="lightGray"/>
           <w:lang w:eastAsia="pt-BR"/>
         </w:rPr>
-        <w:t>Sugestões de continuidade (</w:t>
-      </w:r>
-      <w:proofErr w:type="spellStart"/>
-      <w:r>
-        <w:rPr>
-          <w:rFonts w:eastAsia="Times New Roman" w:cs="Times New Roman"/>
-          <w:szCs w:val="24"/>
-          <w:highlight w:val="lightGray"/>
-          <w:lang w:eastAsia="pt-BR"/>
-        </w:rPr>
-        <w:t>ex</w:t>
-      </w:r>
-      <w:proofErr w:type="spellEnd"/>
-      <w:r>
-        <w:rPr>
-          <w:rFonts w:eastAsia="Times New Roman" w:cs="Times New Roman"/>
-          <w:szCs w:val="24"/>
-          <w:highlight w:val="lightGray"/>
-          <w:lang w:eastAsia="pt-BR"/>
-        </w:rPr>
-        <w:t xml:space="preserve">: aplicar SHAP, testar </w:t>
-      </w:r>
-      <w:proofErr w:type="spellStart"/>
-      <w:r>
-        <w:rPr>
-          <w:rFonts w:eastAsia="Times New Roman" w:cs="Times New Roman"/>
-          <w:szCs w:val="24"/>
-          <w:highlight w:val="lightGray"/>
-          <w:lang w:eastAsia="pt-BR"/>
-        </w:rPr>
-        <w:t>deep</w:t>
-      </w:r>
-      <w:proofErr w:type="spellEnd"/>
-      <w:r>
-        <w:rPr>
-          <w:rFonts w:eastAsia="Times New Roman" w:cs="Times New Roman"/>
-          <w:szCs w:val="24"/>
-          <w:highlight w:val="lightGray"/>
-          <w:lang w:eastAsia="pt-BR"/>
-        </w:rPr>
-        <w:t xml:space="preserve"> </w:t>
-      </w:r>
-      <w:proofErr w:type="spellStart"/>
-      <w:r>
-        <w:rPr>
-          <w:rFonts w:eastAsia="Times New Roman" w:cs="Times New Roman"/>
-          <w:szCs w:val="24"/>
-          <w:highlight w:val="lightGray"/>
-          <w:lang w:eastAsia="pt-BR"/>
-        </w:rPr>
-        <w:t>learning</w:t>
-      </w:r>
-      <w:proofErr w:type="spellEnd"/>
-      <w:r>
-        <w:rPr>
-          <w:rFonts w:eastAsia="Times New Roman" w:cs="Times New Roman"/>
-          <w:szCs w:val="24"/>
-          <w:highlight w:val="lightGray"/>
-          <w:lang w:eastAsia="pt-BR"/>
-        </w:rPr>
-        <w:t>, expandir base de dados)</w:t>
+        <w:t>Sugestões de continuidade (ex: aplicar SHAP, testar deep learning, expandir base de dados)</w:t>
       </w:r>
     </w:p>
     <w:p>
@@ -12977,23 +10800,13 @@
           <w:lang w:eastAsia="pt-BR"/>
         </w:rPr>
       </w:pPr>
-      <w:proofErr w:type="spellStart"/>
-      <w:r>
-        <w:rPr>
-          <w:rFonts w:eastAsia="Times New Roman" w:cs="Times New Roman"/>
-          <w:szCs w:val="24"/>
-          <w:lang w:eastAsia="pt-BR"/>
-        </w:rPr>
-        <w:t>Real_collab</w:t>
-      </w:r>
-      <w:proofErr w:type="spellEnd"/>
-      <w:r>
-        <w:rPr>
-          <w:rFonts w:eastAsia="Times New Roman" w:cs="Times New Roman"/>
-          <w:szCs w:val="24"/>
-          <w:lang w:eastAsia="pt-BR"/>
-        </w:rPr>
-        <w:t xml:space="preserve"> se mostrou (mais/menos) eficiente em máquina X.</w:t>
+      <w:r>
+        <w:rPr>
+          <w:rFonts w:eastAsia="Times New Roman" w:cs="Times New Roman"/>
+          <w:szCs w:val="24"/>
+          <w:lang w:eastAsia="pt-BR"/>
+        </w:rPr>
+        <w:t>Real_collab se mostrou (mais/menos) eficiente em máquina X.</w:t>
       </w:r>
     </w:p>
     <w:p>
@@ -13010,41 +10823,13 @@
           <w:lang w:eastAsia="pt-BR"/>
         </w:rPr>
       </w:pPr>
-      <w:proofErr w:type="spellStart"/>
-      <w:r>
-        <w:rPr>
-          <w:rFonts w:eastAsia="Times New Roman" w:cs="Times New Roman"/>
-          <w:szCs w:val="24"/>
-          <w:lang w:eastAsia="pt-BR"/>
-        </w:rPr>
-        <w:t>Random</w:t>
-      </w:r>
-      <w:proofErr w:type="spellEnd"/>
-      <w:r>
-        <w:rPr>
-          <w:rFonts w:eastAsia="Times New Roman" w:cs="Times New Roman"/>
-          <w:szCs w:val="24"/>
-          <w:lang w:eastAsia="pt-BR"/>
-        </w:rPr>
-        <w:t xml:space="preserve"> Forest se destacou em métricas preditivas, enquanto CART apresentou melhor </w:t>
-      </w:r>
-      <w:proofErr w:type="spellStart"/>
-      <w:r>
-        <w:rPr>
-          <w:rFonts w:eastAsia="Times New Roman" w:cs="Times New Roman"/>
-          <w:szCs w:val="24"/>
-          <w:lang w:eastAsia="pt-BR"/>
-        </w:rPr>
-        <w:t>interpretabilidade</w:t>
-      </w:r>
-      <w:proofErr w:type="spellEnd"/>
-      <w:r>
-        <w:rPr>
-          <w:rFonts w:eastAsia="Times New Roman" w:cs="Times New Roman"/>
-          <w:szCs w:val="24"/>
-          <w:lang w:eastAsia="pt-BR"/>
-        </w:rPr>
-        <w:t>.</w:t>
+      <w:r>
+        <w:rPr>
+          <w:rFonts w:eastAsia="Times New Roman" w:cs="Times New Roman"/>
+          <w:szCs w:val="24"/>
+          <w:lang w:eastAsia="pt-BR"/>
+        </w:rPr>
+        <w:t>Random Forest se destacou em métricas preditivas, enquanto CART apresentou melhor interpretabilidade.</w:t>
       </w:r>
     </w:p>
     <w:p>
@@ -13132,23 +10917,13 @@
           <w:lang w:eastAsia="pt-BR"/>
         </w:rPr>
       </w:pPr>
-      <w:proofErr w:type="spellStart"/>
-      <w:r>
-        <w:rPr>
-          <w:rFonts w:eastAsia="Times New Roman" w:cs="Times New Roman"/>
-          <w:szCs w:val="24"/>
-          <w:lang w:eastAsia="pt-BR"/>
-        </w:rPr>
-        <w:t>Random</w:t>
-      </w:r>
-      <w:proofErr w:type="spellEnd"/>
-      <w:r>
-        <w:rPr>
-          <w:rFonts w:eastAsia="Times New Roman" w:cs="Times New Roman"/>
-          <w:szCs w:val="24"/>
-          <w:lang w:eastAsia="pt-BR"/>
-        </w:rPr>
-        <w:t xml:space="preserve"> Forest é mais robusto em desempenho, mas o CART pode ser preferido onde simplicidade e agilidade são exigidas.</w:t>
+      <w:r>
+        <w:rPr>
+          <w:rFonts w:eastAsia="Times New Roman" w:cs="Times New Roman"/>
+          <w:szCs w:val="24"/>
+          <w:lang w:eastAsia="pt-BR"/>
+        </w:rPr>
+        <w:t>Random Forest é mais robusto em desempenho, mas o CART pode ser preferido onde simplicidade e agilidade são exigidas.</w:t>
       </w:r>
     </w:p>
     <w:p>
@@ -13210,17 +10985,9 @@
         <w:rPr>
           <w:highlight w:val="yellow"/>
         </w:rPr>
-        <w:t xml:space="preserve">Trabalhos </w:t>
-      </w:r>
-      <w:proofErr w:type="spellStart"/>
-      <w:r>
-        <w:rPr>
-          <w:highlight w:val="yellow"/>
-        </w:rPr>
-        <w:t>Futuros</w:t>
+        <w:t>Trabalhos Futuros</w:t>
       </w:r>
       <w:bookmarkEnd w:id="23"/>
-      <w:proofErr w:type="spellEnd"/>
     </w:p>
     <w:p>
       <w:pPr>
@@ -13287,47 +11054,11 @@
         </w:rPr>
         <w:t xml:space="preserve">. </w:t>
       </w:r>
-      <w:proofErr w:type="spellStart"/>
-      <w:r>
-        <w:rPr>
-          <w:highlight w:val="lightGray"/>
-        </w:rPr>
-        <w:t>Annals</w:t>
-      </w:r>
-      <w:proofErr w:type="spellEnd"/>
-      <w:r>
-        <w:rPr>
-          <w:highlight w:val="lightGray"/>
-        </w:rPr>
-        <w:t xml:space="preserve"> </w:t>
-      </w:r>
-      <w:proofErr w:type="spellStart"/>
-      <w:r>
-        <w:rPr>
-          <w:highlight w:val="lightGray"/>
-        </w:rPr>
-        <w:t>of</w:t>
-      </w:r>
-      <w:proofErr w:type="spellEnd"/>
-      <w:r>
-        <w:rPr>
-          <w:highlight w:val="lightGray"/>
-        </w:rPr>
-        <w:t xml:space="preserve"> </w:t>
-      </w:r>
-      <w:proofErr w:type="spellStart"/>
-      <w:r>
-        <w:rPr>
-          <w:highlight w:val="lightGray"/>
-        </w:rPr>
-        <w:t>Epidemiology</w:t>
-      </w:r>
-      <w:proofErr w:type="spellEnd"/>
-      <w:r>
-        <w:rPr>
-          <w:highlight w:val="lightGray"/>
-        </w:rPr>
-        <w:t xml:space="preserve">, v. 108, p. 1–7, 2025. Disponível em: </w:t>
+      <w:r>
+        <w:rPr>
+          <w:highlight w:val="lightGray"/>
+        </w:rPr>
+        <w:t xml:space="preserve">Annals of Epidemiology, v. 108, p. 1–7, 2025. Disponível em: </w:t>
       </w:r>
       <w:hyperlink r:id="rId19" w:tgtFrame="_new" w:history="1">
         <w:r>
@@ -13554,11 +11285,9 @@
       <w:r>
         <w:t xml:space="preserve"> </w:t>
       </w:r>
-      <w:proofErr w:type="spellStart"/>
       <w:r>
         <w:t>Overfitting</w:t>
       </w:r>
-      <w:proofErr w:type="spellEnd"/>
       <w:r>
         <w:t>: o</w:t>
       </w:r>

</xml_diff>